<commit_message>
Promote PCR-008 Version 2.0 (81 pp) after fix and readability passes; re-render PTP-001 (Protein A load NOR 20-40 restored), RA-001, PCP-004, PCP-008 and PCP-009 for the criteria at manufacturing scale; PTP-001 annex rebuilt (all grounded)
Co-Authored-By: Claude Opus 5.5 <noreply@anthropic.com>
</commit_message>
<xml_diff>
--- a/pc_package/PTP-001_transfer.docx
+++ b/pc_package/PTP-001_transfer.docx
@@ -4124,7 +4124,7 @@
         </w:r>
       </w:hyperlink>
       <w:r>
-        <w:t xml:space="preserve">), with the set-point, NOR, characterized range and class of every parameter. It includes the set-points and NORs that the Protein A report PCR-005 and the low-pH viral inactivation report PCR-006 changed at Version 2.0, and its footnotes give the value the studies were planned against.</w:t>
+        <w:t xml:space="preserve">), with the set-point, NOR, characterized range and class of every parameter. It includes the set-points and NORs that the low-pH viral inactivation report PCR-006 changed at Version 2.0, and its footnotes give the value the studies were planned against.</w:t>
       </w:r>
     </w:p>
     <w:p>
@@ -7587,7 +7587,7 @@
         <w:t xml:space="preserve"> </w:t>
       </w:r>
       <w:r>
-        <w:t xml:space="preserve">gives every process parameter with its set-point, NOR, characterized range and class as they stand at this revision. The class is the one assigned in the report of the step under the parameter classification procedure SOP-4001. The set-point and the NOR are those in force. Some of them were changed at Version 2.0 by the report of their step, after the studies. For Protein A, the NOR of protein load was narrowed (PCR-005). For low-pH viral inactivation, the NOR and the set-point of inactivation pH were moved, the NOR of hold time was narrowed and its set-point moved, and the NOR of temperature was narrowed (PCR-006). The report of the step gives the reason for each change.</w:t>
+        <w:t xml:space="preserve">gives every process parameter with its set-point, NOR, characterized range and class as they stand at this revision. The class is the one assigned in the report of the step under the parameter classification procedure SOP-4001. The set-point and the NOR are those in force. Some of them were changed at Version 2.0 by the report of their step, after the studies. For low-pH viral inactivation, the NOR and the set-point of inactivation pH were moved, the NOR of hold time was narrowed and its set-point moved, and the NOR of temperature was narrowed (PCR-006). The report of the step gives the reason for each change.</w:t>
       </w:r>
     </w:p>
     <w:tbl>
@@ -8835,7 +8835,528 @@
                     <w:jc w:val="center"/>
                   </w:pPr>
                   <w:r>
-                    <w:t xml:space="preserve">20–39</w:t>
+                    <w:t xml:space="preserve">20–40</w:t>
+                  </w:r>
+                </w:p>
+              </w:tc>
+              <w:tc>
+                <w:tcPr/>
+                <w:p>
+                  <w:pPr>
+                    <w:pStyle w:val="Compact"/>
+                    <w:jc w:val="center"/>
+                  </w:pPr>
+                  <w:r>
+                    <w:t xml:space="preserve">10–50</w:t>
+                  </w:r>
+                </w:p>
+              </w:tc>
+              <w:tc>
+                <w:tcPr/>
+                <w:p>
+                  <w:pPr>
+                    <w:pStyle w:val="Compact"/>
+                    <w:jc w:val="center"/>
+                  </w:pPr>
+                  <w:r>
+                    <w:t xml:space="preserve">WC-CPP</w:t>
+                  </w:r>
+                </w:p>
+              </w:tc>
+            </w:tr>
+            <w:tr>
+              <w:tc>
+                <w:tcPr>
+                  <w:gridSpan w:val="1"/>
+                  <w:vMerge w:val="continue"/>
+                </w:tcPr>
+                <w:p>
+                  <w:pPr/>
+                </w:p>
+              </w:tc>
+              <w:tc>
+                <w:tcPr/>
+                <w:p>
+                  <w:pPr>
+                    <w:pStyle w:val="Compact"/>
+                    <w:jc w:val="center"/>
+                  </w:pPr>
+                  <w:r>
+                    <w:t xml:space="preserve">Elution buffer pH</w:t>
+                  </w:r>
+                </w:p>
+              </w:tc>
+              <w:tc>
+                <w:tcPr/>
+                <w:p>
+                  <w:pPr>
+                    <w:pStyle w:val="Compact"/>
+                    <w:jc w:val="center"/>
+                  </w:pPr>
+                  <w:r>
+                    <w:t xml:space="preserve">pH</w:t>
+                  </w:r>
+                </w:p>
+              </w:tc>
+              <w:tc>
+                <w:tcPr/>
+                <w:p>
+                  <w:pPr>
+                    <w:pStyle w:val="Compact"/>
+                    <w:jc w:val="center"/>
+                  </w:pPr>
+                  <w:r>
+                    <w:t xml:space="preserve">3.55</w:t>
+                  </w:r>
+                </w:p>
+              </w:tc>
+              <w:tc>
+                <w:tcPr/>
+                <w:p>
+                  <w:pPr>
+                    <w:pStyle w:val="Compact"/>
+                    <w:jc w:val="center"/>
+                  </w:pPr>
+                  <w:r>
+                    <w:t xml:space="preserve">3.4–3.7</w:t>
+                  </w:r>
+                </w:p>
+              </w:tc>
+              <w:tc>
+                <w:tcPr/>
+                <w:p>
+                  <w:pPr>
+                    <w:pStyle w:val="Compact"/>
+                    <w:jc w:val="center"/>
+                  </w:pPr>
+                  <w:r>
+                    <w:t xml:space="preserve">3.2–3.9</w:t>
+                  </w:r>
+                </w:p>
+              </w:tc>
+              <w:tc>
+                <w:tcPr/>
+                <w:p>
+                  <w:pPr>
+                    <w:pStyle w:val="Compact"/>
+                    <w:jc w:val="center"/>
+                  </w:pPr>
+                  <w:r>
+                    <w:t xml:space="preserve">WC-CPP</w:t>
+                  </w:r>
+                </w:p>
+              </w:tc>
+            </w:tr>
+            <w:tr>
+              <w:tc>
+                <w:tcPr>
+                  <w:gridSpan w:val="1"/>
+                  <w:vMerge w:val="continue"/>
+                </w:tcPr>
+                <w:p>
+                  <w:pPr/>
+                </w:p>
+              </w:tc>
+              <w:tc>
+                <w:tcPr/>
+                <w:p>
+                  <w:pPr>
+                    <w:pStyle w:val="Compact"/>
+                    <w:jc w:val="center"/>
+                  </w:pPr>
+                  <w:r>
+                    <w:t xml:space="preserve">Load flow rate</w:t>
+                  </w:r>
+                </w:p>
+              </w:tc>
+              <w:tc>
+                <w:tcPr/>
+                <w:p>
+                  <w:pPr>
+                    <w:pStyle w:val="Compact"/>
+                    <w:jc w:val="center"/>
+                  </w:pPr>
+                  <w:r>
+                    <w:t xml:space="preserve">cm/hr</w:t>
+                  </w:r>
+                </w:p>
+              </w:tc>
+              <w:tc>
+                <w:tcPr/>
+                <w:p>
+                  <w:pPr>
+                    <w:pStyle w:val="Compact"/>
+                    <w:jc w:val="center"/>
+                  </w:pPr>
+                  <w:r>
+                    <w:t xml:space="preserve">200</w:t>
+                  </w:r>
+                </w:p>
+              </w:tc>
+              <w:tc>
+                <w:tcPr/>
+                <w:p>
+                  <w:pPr>
+                    <w:pStyle w:val="Compact"/>
+                    <w:jc w:val="center"/>
+                  </w:pPr>
+                  <w:r>
+                    <w:t xml:space="preserve">150–250</w:t>
+                  </w:r>
+                </w:p>
+              </w:tc>
+              <w:tc>
+                <w:tcPr/>
+                <w:p>
+                  <w:pPr>
+                    <w:pStyle w:val="Compact"/>
+                    <w:jc w:val="center"/>
+                  </w:pPr>
+                  <w:r>
+                    <w:t xml:space="preserve">100–300</w:t>
+                  </w:r>
+                </w:p>
+              </w:tc>
+              <w:tc>
+                <w:tcPr/>
+                <w:p>
+                  <w:pPr>
+                    <w:pStyle w:val="Compact"/>
+                    <w:jc w:val="center"/>
+                  </w:pPr>
+                  <w:r>
+                    <w:t xml:space="preserve">KPP</w:t>
+                  </w:r>
+                </w:p>
+              </w:tc>
+            </w:tr>
+            <w:tr>
+              <w:tc>
+                <w:tcPr>
+                  <w:gridSpan w:val="1"/>
+                  <w:vMerge w:val="continue"/>
+                </w:tcPr>
+                <w:p>
+                  <w:pPr/>
+                </w:p>
+              </w:tc>
+              <w:tc>
+                <w:tcPr/>
+                <w:p>
+                  <w:pPr>
+                    <w:pStyle w:val="Compact"/>
+                    <w:jc w:val="center"/>
+                  </w:pPr>
+                  <w:r>
+                    <w:t xml:space="preserve">End of pool collect</w:t>
+                  </w:r>
+                </w:p>
+              </w:tc>
+              <w:tc>
+                <w:tcPr/>
+                <w:p>
+                  <w:pPr>
+                    <w:pStyle w:val="Compact"/>
+                    <w:jc w:val="center"/>
+                  </w:pPr>
+                  <w:r>
+                    <w:t xml:space="preserve">CV</w:t>
+                  </w:r>
+                </w:p>
+              </w:tc>
+              <w:tc>
+                <w:tcPr/>
+                <w:p>
+                  <w:pPr>
+                    <w:pStyle w:val="Compact"/>
+                    <w:jc w:val="center"/>
+                  </w:pPr>
+                  <w:r>
+                    <w:t xml:space="preserve">2.6</w:t>
+                  </w:r>
+                </w:p>
+              </w:tc>
+              <w:tc>
+                <w:tcPr/>
+                <w:p>
+                  <w:pPr>
+                    <w:pStyle w:val="Compact"/>
+                    <w:jc w:val="center"/>
+                  </w:pPr>
+                  <w:r>
+                    <w:t xml:space="preserve">2.3–2.9</w:t>
+                  </w:r>
+                </w:p>
+              </w:tc>
+              <w:tc>
+                <w:tcPr/>
+                <w:p>
+                  <w:pPr>
+                    <w:pStyle w:val="Compact"/>
+                    <w:jc w:val="center"/>
+                  </w:pPr>
+                  <w:r>
+                    <w:t xml:space="preserve">2–3.2</w:t>
+                  </w:r>
+                </w:p>
+              </w:tc>
+              <w:tc>
+                <w:tcPr/>
+                <w:p>
+                  <w:pPr>
+                    <w:pStyle w:val="Compact"/>
+                    <w:jc w:val="center"/>
+                  </w:pPr>
+                  <w:r>
+                    <w:t xml:space="preserve">KPP</w:t>
+                  </w:r>
+                </w:p>
+              </w:tc>
+            </w:tr>
+            <w:tr>
+              <w:tc>
+                <w:tcPr>
+                  <w:gridSpan w:val="1"/>
+                  <w:vMerge w:val="continue"/>
+                </w:tcPr>
+                <w:p>
+                  <w:pPr/>
+                </w:p>
+              </w:tc>
+              <w:tc>
+                <w:tcPr/>
+                <w:p>
+                  <w:pPr>
+                    <w:pStyle w:val="Compact"/>
+                    <w:jc w:val="center"/>
+                  </w:pPr>
+                  <w:r>
+                    <w:t xml:space="preserve">Operating temperature</w:t>
+                  </w:r>
+                  <w:r>
+                    <w:rPr>
+                      <w:vertAlign w:val="superscript"/>
+                    </w:rPr>
+                    <w:t xml:space="preserve">a)</w:t>
+                  </w:r>
+                </w:p>
+              </w:tc>
+              <w:tc>
+                <w:tcPr/>
+                <w:p>
+                  <w:pPr>
+                    <w:pStyle w:val="Compact"/>
+                    <w:jc w:val="center"/>
+                  </w:pPr>
+                  <w:r>
+                    <w:t xml:space="preserve">°C</w:t>
+                  </w:r>
+                </w:p>
+              </w:tc>
+              <w:tc>
+                <w:tcPr/>
+                <w:p>
+                  <w:pPr>
+                    <w:pStyle w:val="Compact"/>
+                    <w:jc w:val="center"/>
+                  </w:pPr>
+                  <w:r>
+                    <w:t xml:space="preserve">22</w:t>
+                  </w:r>
+                </w:p>
+              </w:tc>
+              <w:tc>
+                <w:tcPr/>
+                <w:p>
+                  <w:pPr>
+                    <w:pStyle w:val="Compact"/>
+                    <w:jc w:val="center"/>
+                  </w:pPr>
+                  <w:r>
+                    <w:t xml:space="preserve">18–26</w:t>
+                  </w:r>
+                </w:p>
+              </w:tc>
+              <w:tc>
+                <w:tcPr/>
+                <w:p>
+                  <w:pPr>
+                    <w:pStyle w:val="Compact"/>
+                    <w:jc w:val="center"/>
+                  </w:pPr>
+                  <w:r>
+                    <w:t xml:space="preserve">15–30</w:t>
+                  </w:r>
+                </w:p>
+              </w:tc>
+              <w:tc>
+                <w:tcPr/>
+                <w:p>
+                  <w:pPr>
+                    <w:pStyle w:val="Compact"/>
+                    <w:jc w:val="center"/>
+                  </w:pPr>
+                  <w:r>
+                    <w:t xml:space="preserve">GPP</w:t>
+                  </w:r>
+                </w:p>
+              </w:tc>
+            </w:tr>
+            <w:tr>
+              <w:tc>
+                <w:tcPr>
+                  <w:gridSpan w:val="1"/>
+                  <w:vMerge w:val="continue"/>
+                </w:tcPr>
+                <w:p>
+                  <w:pPr/>
+                </w:p>
+              </w:tc>
+              <w:tc>
+                <w:tcPr/>
+                <w:p>
+                  <w:pPr>
+                    <w:pStyle w:val="Compact"/>
+                    <w:jc w:val="center"/>
+                  </w:pPr>
+                  <w:r>
+                    <w:t xml:space="preserve">Bed height</w:t>
+                  </w:r>
+                  <w:r>
+                    <w:rPr>
+                      <w:vertAlign w:val="superscript"/>
+                    </w:rPr>
+                    <w:t xml:space="preserve">a)</w:t>
+                  </w:r>
+                </w:p>
+              </w:tc>
+              <w:tc>
+                <w:tcPr/>
+                <w:p>
+                  <w:pPr>
+                    <w:pStyle w:val="Compact"/>
+                    <w:jc w:val="center"/>
+                  </w:pPr>
+                  <w:r>
+                    <w:t xml:space="preserve">cm</w:t>
+                  </w:r>
+                </w:p>
+              </w:tc>
+              <w:tc>
+                <w:tcPr/>
+                <w:p>
+                  <w:pPr>
+                    <w:pStyle w:val="Compact"/>
+                    <w:jc w:val="center"/>
+                  </w:pPr>
+                  <w:r>
+                    <w:t xml:space="preserve">20</w:t>
+                  </w:r>
+                </w:p>
+              </w:tc>
+              <w:tc>
+                <w:tcPr/>
+                <w:p>
+                  <w:pPr>
+                    <w:pStyle w:val="Compact"/>
+                    <w:jc w:val="center"/>
+                  </w:pPr>
+                  <w:r>
+                    <w:t xml:space="preserve">15–25</w:t>
+                  </w:r>
+                </w:p>
+              </w:tc>
+              <w:tc>
+                <w:tcPr/>
+                <w:p>
+                  <w:pPr>
+                    <w:pStyle w:val="Compact"/>
+                    <w:jc w:val="center"/>
+                  </w:pPr>
+                  <w:r>
+                    <w:t xml:space="preserve">10–30</w:t>
+                  </w:r>
+                </w:p>
+              </w:tc>
+              <w:tc>
+                <w:tcPr/>
+                <w:p>
+                  <w:pPr>
+                    <w:pStyle w:val="Compact"/>
+                    <w:jc w:val="center"/>
+                  </w:pPr>
+                  <w:r>
+                    <w:t xml:space="preserve">GPP</w:t>
+                  </w:r>
+                </w:p>
+              </w:tc>
+            </w:tr>
+            <w:tr>
+              <w:tc>
+                <w:tcPr>
+                  <w:vMerge w:val="restart"/>
+                </w:tcPr>
+                <w:p>
+                  <w:pPr>
+                    <w:pStyle w:val="Compact"/>
+                    <w:jc w:val="center"/>
+                  </w:pPr>
+                  <w:r>
+                    <w:t xml:space="preserve">Low-pH viral inactivation</w:t>
+                  </w:r>
+                </w:p>
+              </w:tc>
+              <w:tc>
+                <w:tcPr/>
+                <w:p>
+                  <w:pPr>
+                    <w:pStyle w:val="Compact"/>
+                    <w:jc w:val="center"/>
+                  </w:pPr>
+                  <w:r>
+                    <w:t xml:space="preserve">Inactivation pH</w:t>
+                  </w:r>
+                </w:p>
+              </w:tc>
+              <w:tc>
+                <w:tcPr/>
+                <w:p>
+                  <w:pPr>
+                    <w:pStyle w:val="Compact"/>
+                    <w:jc w:val="center"/>
+                  </w:pPr>
+                  <w:r>
+                    <w:t xml:space="preserve">pH</w:t>
+                  </w:r>
+                </w:p>
+              </w:tc>
+              <w:tc>
+                <w:tcPr/>
+                <w:p>
+                  <w:pPr>
+                    <w:pStyle w:val="Compact"/>
+                    <w:jc w:val="center"/>
+                  </w:pPr>
+                  <w:r>
+                    <w:t xml:space="preserve">3.4</w:t>
+                  </w:r>
+                  <w:r>
+                    <w:rPr>
+                      <w:vertAlign w:val="superscript"/>
+                    </w:rPr>
+                    <w:t xml:space="preserve">c2)</w:t>
+                  </w:r>
+                </w:p>
+              </w:tc>
+              <w:tc>
+                <w:tcPr/>
+                <w:p>
+                  <w:pPr>
+                    <w:pStyle w:val="Compact"/>
+                    <w:jc w:val="center"/>
+                  </w:pPr>
+                  <w:r>
+                    <w:t xml:space="preserve">3.3–3.5</w:t>
                   </w:r>
                   <w:r>
                     <w:rPr>
@@ -8853,19 +9374,19 @@
                     <w:jc w:val="center"/>
                   </w:pPr>
                   <w:r>
-                    <w:t xml:space="preserve">10–50</w:t>
-                  </w:r>
-                </w:p>
-              </w:tc>
-              <w:tc>
-                <w:tcPr/>
-                <w:p>
-                  <w:pPr>
-                    <w:pStyle w:val="Compact"/>
-                    <w:jc w:val="center"/>
-                  </w:pPr>
-                  <w:r>
-                    <w:t xml:space="preserve">WC-CPP</w:t>
+                    <w:t xml:space="preserve">3.2–4</w:t>
+                  </w:r>
+                </w:p>
+              </w:tc>
+              <w:tc>
+                <w:tcPr/>
+                <w:p>
+                  <w:pPr>
+                    <w:pStyle w:val="Compact"/>
+                    <w:jc w:val="center"/>
+                  </w:pPr>
+                  <w:r>
+                    <w:t xml:space="preserve">CPP</w:t>
                   </w:r>
                 </w:p>
               </w:tc>
@@ -8888,55 +9409,67 @@
                     <w:jc w:val="center"/>
                   </w:pPr>
                   <w:r>
-                    <w:t xml:space="preserve">Elution buffer pH</w:t>
-                  </w:r>
-                </w:p>
-              </w:tc>
-              <w:tc>
-                <w:tcPr/>
-                <w:p>
-                  <w:pPr>
-                    <w:pStyle w:val="Compact"/>
-                    <w:jc w:val="center"/>
-                  </w:pPr>
-                  <w:r>
-                    <w:t xml:space="preserve">pH</w:t>
-                  </w:r>
-                </w:p>
-              </w:tc>
-              <w:tc>
-                <w:tcPr/>
-                <w:p>
-                  <w:pPr>
-                    <w:pStyle w:val="Compact"/>
-                    <w:jc w:val="center"/>
-                  </w:pPr>
-                  <w:r>
-                    <w:t xml:space="preserve">3.55</w:t>
-                  </w:r>
-                </w:p>
-              </w:tc>
-              <w:tc>
-                <w:tcPr/>
-                <w:p>
-                  <w:pPr>
-                    <w:pStyle w:val="Compact"/>
-                    <w:jc w:val="center"/>
-                  </w:pPr>
-                  <w:r>
-                    <w:t xml:space="preserve">3.4–3.7</w:t>
-                  </w:r>
-                </w:p>
-              </w:tc>
-              <w:tc>
-                <w:tcPr/>
-                <w:p>
-                  <w:pPr>
-                    <w:pStyle w:val="Compact"/>
-                    <w:jc w:val="center"/>
-                  </w:pPr>
-                  <w:r>
-                    <w:t xml:space="preserve">3.2–3.9</w:t>
+                    <w:t xml:space="preserve">Hold time</w:t>
+                  </w:r>
+                </w:p>
+              </w:tc>
+              <w:tc>
+                <w:tcPr/>
+                <w:p>
+                  <w:pPr>
+                    <w:pStyle w:val="Compact"/>
+                    <w:jc w:val="center"/>
+                  </w:pPr>
+                  <w:r>
+                    <w:t xml:space="preserve">min</w:t>
+                  </w:r>
+                </w:p>
+              </w:tc>
+              <w:tc>
+                <w:tcPr/>
+                <w:p>
+                  <w:pPr>
+                    <w:pStyle w:val="Compact"/>
+                    <w:jc w:val="center"/>
+                  </w:pPr>
+                  <w:r>
+                    <w:t xml:space="preserve">110</w:t>
+                  </w:r>
+                  <w:r>
+                    <w:rPr>
+                      <w:vertAlign w:val="superscript"/>
+                    </w:rPr>
+                    <w:t xml:space="preserve">c4)</w:t>
+                  </w:r>
+                </w:p>
+              </w:tc>
+              <w:tc>
+                <w:tcPr/>
+                <w:p>
+                  <w:pPr>
+                    <w:pStyle w:val="Compact"/>
+                    <w:jc w:val="center"/>
+                  </w:pPr>
+                  <w:r>
+                    <w:t xml:space="preserve">100–120</w:t>
+                  </w:r>
+                  <w:r>
+                    <w:rPr>
+                      <w:vertAlign w:val="superscript"/>
+                    </w:rPr>
+                    <w:t xml:space="preserve">c3)</w:t>
+                  </w:r>
+                </w:p>
+              </w:tc>
+              <w:tc>
+                <w:tcPr/>
+                <w:p>
+                  <w:pPr>
+                    <w:pStyle w:val="Compact"/>
+                    <w:jc w:val="center"/>
+                  </w:pPr>
+                  <w:r>
+                    <w:t xml:space="preserve">60–180</w:t>
                   </w:r>
                 </w:p>
               </w:tc>
@@ -8971,67 +9504,73 @@
                     <w:jc w:val="center"/>
                   </w:pPr>
                   <w:r>
-                    <w:t xml:space="preserve">Load flow rate</w:t>
-                  </w:r>
-                </w:p>
-              </w:tc>
-              <w:tc>
-                <w:tcPr/>
-                <w:p>
-                  <w:pPr>
-                    <w:pStyle w:val="Compact"/>
-                    <w:jc w:val="center"/>
-                  </w:pPr>
-                  <w:r>
-                    <w:t xml:space="preserve">cm/hr</w:t>
-                  </w:r>
-                </w:p>
-              </w:tc>
-              <w:tc>
-                <w:tcPr/>
-                <w:p>
-                  <w:pPr>
-                    <w:pStyle w:val="Compact"/>
-                    <w:jc w:val="center"/>
-                  </w:pPr>
-                  <w:r>
-                    <w:t xml:space="preserve">200</w:t>
-                  </w:r>
-                </w:p>
-              </w:tc>
-              <w:tc>
-                <w:tcPr/>
-                <w:p>
-                  <w:pPr>
-                    <w:pStyle w:val="Compact"/>
-                    <w:jc w:val="center"/>
-                  </w:pPr>
-                  <w:r>
-                    <w:t xml:space="preserve">150–250</w:t>
-                  </w:r>
-                </w:p>
-              </w:tc>
-              <w:tc>
-                <w:tcPr/>
-                <w:p>
-                  <w:pPr>
-                    <w:pStyle w:val="Compact"/>
-                    <w:jc w:val="center"/>
-                  </w:pPr>
-                  <w:r>
-                    <w:t xml:space="preserve">100–300</w:t>
-                  </w:r>
-                </w:p>
-              </w:tc>
-              <w:tc>
-                <w:tcPr/>
-                <w:p>
-                  <w:pPr>
-                    <w:pStyle w:val="Compact"/>
-                    <w:jc w:val="center"/>
-                  </w:pPr>
-                  <w:r>
-                    <w:t xml:space="preserve">KPP</w:t>
+                    <w:t xml:space="preserve">Temperature</w:t>
+                  </w:r>
+                </w:p>
+              </w:tc>
+              <w:tc>
+                <w:tcPr/>
+                <w:p>
+                  <w:pPr>
+                    <w:pStyle w:val="Compact"/>
+                    <w:jc w:val="center"/>
+                  </w:pPr>
+                  <w:r>
+                    <w:t xml:space="preserve">°C</w:t>
+                  </w:r>
+                </w:p>
+              </w:tc>
+              <w:tc>
+                <w:tcPr/>
+                <w:p>
+                  <w:pPr>
+                    <w:pStyle w:val="Compact"/>
+                    <w:jc w:val="center"/>
+                  </w:pPr>
+                  <w:r>
+                    <w:t xml:space="preserve">21</w:t>
+                  </w:r>
+                </w:p>
+              </w:tc>
+              <w:tc>
+                <w:tcPr/>
+                <w:p>
+                  <w:pPr>
+                    <w:pStyle w:val="Compact"/>
+                    <w:jc w:val="center"/>
+                  </w:pPr>
+                  <w:r>
+                    <w:t xml:space="preserve">20–23</w:t>
+                  </w:r>
+                  <w:r>
+                    <w:rPr>
+                      <w:vertAlign w:val="superscript"/>
+                    </w:rPr>
+                    <w:t xml:space="preserve">c5)</w:t>
+                  </w:r>
+                </w:p>
+              </w:tc>
+              <w:tc>
+                <w:tcPr/>
+                <w:p>
+                  <w:pPr>
+                    <w:pStyle w:val="Compact"/>
+                    <w:jc w:val="center"/>
+                  </w:pPr>
+                  <w:r>
+                    <w:t xml:space="preserve">15–25</w:t>
+                  </w:r>
+                </w:p>
+              </w:tc>
+              <w:tc>
+                <w:tcPr/>
+                <w:p>
+                  <w:pPr>
+                    <w:pStyle w:val="Compact"/>
+                    <w:jc w:val="center"/>
+                  </w:pPr>
+                  <w:r>
+                    <w:t xml:space="preserve">WC-CPP</w:t>
                   </w:r>
                 </w:p>
               </w:tc>
@@ -9054,67 +9593,167 @@
                     <w:jc w:val="center"/>
                   </w:pPr>
                   <w:r>
-                    <w:t xml:space="preserve">End of pool collect</w:t>
-                  </w:r>
-                </w:p>
-              </w:tc>
-              <w:tc>
-                <w:tcPr/>
-                <w:p>
-                  <w:pPr>
-                    <w:pStyle w:val="Compact"/>
-                    <w:jc w:val="center"/>
-                  </w:pPr>
-                  <w:r>
-                    <w:t xml:space="preserve">CV</w:t>
-                  </w:r>
-                </w:p>
-              </w:tc>
-              <w:tc>
-                <w:tcPr/>
-                <w:p>
-                  <w:pPr>
-                    <w:pStyle w:val="Compact"/>
-                    <w:jc w:val="center"/>
-                  </w:pPr>
-                  <w:r>
-                    <w:t xml:space="preserve">2.6</w:t>
-                  </w:r>
-                </w:p>
-              </w:tc>
-              <w:tc>
-                <w:tcPr/>
-                <w:p>
-                  <w:pPr>
-                    <w:pStyle w:val="Compact"/>
-                    <w:jc w:val="center"/>
-                  </w:pPr>
-                  <w:r>
-                    <w:t xml:space="preserve">2.3–2.9</w:t>
-                  </w:r>
-                </w:p>
-              </w:tc>
-              <w:tc>
-                <w:tcPr/>
-                <w:p>
-                  <w:pPr>
-                    <w:pStyle w:val="Compact"/>
-                    <w:jc w:val="center"/>
-                  </w:pPr>
-                  <w:r>
-                    <w:t xml:space="preserve">2–3.2</w:t>
-                  </w:r>
-                </w:p>
-              </w:tc>
-              <w:tc>
-                <w:tcPr/>
-                <w:p>
-                  <w:pPr>
-                    <w:pStyle w:val="Compact"/>
-                    <w:jc w:val="center"/>
-                  </w:pPr>
-                  <w:r>
-                    <w:t xml:space="preserve">KPP</w:t>
+                    <w:t xml:space="preserve">A-Mab concentration</w:t>
+                  </w:r>
+                  <w:r>
+                    <w:rPr>
+                      <w:vertAlign w:val="superscript"/>
+                    </w:rPr>
+                    <w:t xml:space="preserve">a)</w:t>
+                  </w:r>
+                </w:p>
+              </w:tc>
+              <w:tc>
+                <w:tcPr/>
+                <w:p>
+                  <w:pPr>
+                    <w:pStyle w:val="Compact"/>
+                    <w:jc w:val="center"/>
+                  </w:pPr>
+                  <w:r>
+                    <w:t xml:space="preserve">g/L</w:t>
+                  </w:r>
+                </w:p>
+              </w:tc>
+              <w:tc>
+                <w:tcPr/>
+                <w:p>
+                  <w:pPr>
+                    <w:pStyle w:val="Compact"/>
+                    <w:jc w:val="center"/>
+                  </w:pPr>
+                  <w:r>
+                    <w:t xml:space="preserve">20</w:t>
+                  </w:r>
+                </w:p>
+              </w:tc>
+              <w:tc>
+                <w:tcPr/>
+                <w:p>
+                  <w:pPr>
+                    <w:pStyle w:val="Compact"/>
+                    <w:jc w:val="center"/>
+                  </w:pPr>
+                  <w:r>
+                    <w:t xml:space="preserve">as characterized</w:t>
+                  </w:r>
+                  <w:r>
+                    <w:rPr>
+                      <w:vertAlign w:val="superscript"/>
+                    </w:rPr>
+                    <w:t xml:space="preserve">b)</w:t>
+                  </w:r>
+                </w:p>
+              </w:tc>
+              <w:tc>
+                <w:tcPr/>
+                <w:p>
+                  <w:pPr>
+                    <w:pStyle w:val="Compact"/>
+                    <w:jc w:val="center"/>
+                  </w:pPr>
+                  <w:r>
+                    <w:t xml:space="preserve">5–35</w:t>
+                  </w:r>
+                </w:p>
+              </w:tc>
+              <w:tc>
+                <w:tcPr/>
+                <w:p>
+                  <w:pPr>
+                    <w:pStyle w:val="Compact"/>
+                    <w:jc w:val="center"/>
+                  </w:pPr>
+                  <w:r>
+                    <w:t xml:space="preserve">GPP</w:t>
+                  </w:r>
+                </w:p>
+              </w:tc>
+            </w:tr>
+            <w:tr>
+              <w:tc>
+                <w:tcPr>
+                  <w:vMerge w:val="restart"/>
+                </w:tcPr>
+                <w:p>
+                  <w:pPr>
+                    <w:pStyle w:val="Compact"/>
+                    <w:jc w:val="center"/>
+                  </w:pPr>
+                  <w:r>
+                    <w:t xml:space="preserve">Cation exchange</w:t>
+                  </w:r>
+                </w:p>
+              </w:tc>
+              <w:tc>
+                <w:tcPr/>
+                <w:p>
+                  <w:pPr>
+                    <w:pStyle w:val="Compact"/>
+                    <w:jc w:val="center"/>
+                  </w:pPr>
+                  <w:r>
+                    <w:t xml:space="preserve">Protein load</w:t>
+                  </w:r>
+                </w:p>
+              </w:tc>
+              <w:tc>
+                <w:tcPr/>
+                <w:p>
+                  <w:pPr>
+                    <w:pStyle w:val="Compact"/>
+                    <w:jc w:val="center"/>
+                  </w:pPr>
+                  <w:r>
+                    <w:t xml:space="preserve">g/L resin</w:t>
+                  </w:r>
+                </w:p>
+              </w:tc>
+              <w:tc>
+                <w:tcPr/>
+                <w:p>
+                  <w:pPr>
+                    <w:pStyle w:val="Compact"/>
+                    <w:jc w:val="center"/>
+                  </w:pPr>
+                  <w:r>
+                    <w:t xml:space="preserve">25</w:t>
+                  </w:r>
+                </w:p>
+              </w:tc>
+              <w:tc>
+                <w:tcPr/>
+                <w:p>
+                  <w:pPr>
+                    <w:pStyle w:val="Compact"/>
+                    <w:jc w:val="center"/>
+                  </w:pPr>
+                  <w:r>
+                    <w:t xml:space="preserve">18–32</w:t>
+                  </w:r>
+                </w:p>
+              </w:tc>
+              <w:tc>
+                <w:tcPr/>
+                <w:p>
+                  <w:pPr>
+                    <w:pStyle w:val="Compact"/>
+                    <w:jc w:val="center"/>
+                  </w:pPr>
+                  <w:r>
+                    <w:t xml:space="preserve">10–40</w:t>
+                  </w:r>
+                </w:p>
+              </w:tc>
+              <w:tc>
+                <w:tcPr/>
+                <w:p>
+                  <w:pPr>
+                    <w:pStyle w:val="Compact"/>
+                    <w:jc w:val="center"/>
+                  </w:pPr>
+                  <w:r>
+                    <w:t xml:space="preserve">WC-CPP</w:t>
                   </w:r>
                 </w:p>
               </w:tc>
@@ -9137,7 +9776,256 @@
                     <w:jc w:val="center"/>
                   </w:pPr>
                   <w:r>
-                    <w:t xml:space="preserve">Operating temperature</w:t>
+                    <w:t xml:space="preserve">Load/Wash conductivity</w:t>
+                  </w:r>
+                </w:p>
+              </w:tc>
+              <w:tc>
+                <w:tcPr/>
+                <w:p>
+                  <w:pPr>
+                    <w:pStyle w:val="Compact"/>
+                    <w:jc w:val="center"/>
+                  </w:pPr>
+                  <w:r>
+                    <w:t xml:space="preserve">mS/cm</w:t>
+                  </w:r>
+                </w:p>
+              </w:tc>
+              <w:tc>
+                <w:tcPr/>
+                <w:p>
+                  <w:pPr>
+                    <w:pStyle w:val="Compact"/>
+                    <w:jc w:val="center"/>
+                  </w:pPr>
+                  <w:r>
+                    <w:t xml:space="preserve">5</w:t>
+                  </w:r>
+                </w:p>
+              </w:tc>
+              <w:tc>
+                <w:tcPr/>
+                <w:p>
+                  <w:pPr>
+                    <w:pStyle w:val="Compact"/>
+                    <w:jc w:val="center"/>
+                  </w:pPr>
+                  <w:r>
+                    <w:t xml:space="preserve">4–6</w:t>
+                  </w:r>
+                </w:p>
+              </w:tc>
+              <w:tc>
+                <w:tcPr/>
+                <w:p>
+                  <w:pPr>
+                    <w:pStyle w:val="Compact"/>
+                    <w:jc w:val="center"/>
+                  </w:pPr>
+                  <w:r>
+                    <w:t xml:space="preserve">3–7</w:t>
+                  </w:r>
+                </w:p>
+              </w:tc>
+              <w:tc>
+                <w:tcPr/>
+                <w:p>
+                  <w:pPr>
+                    <w:pStyle w:val="Compact"/>
+                    <w:jc w:val="center"/>
+                  </w:pPr>
+                  <w:r>
+                    <w:t xml:space="preserve">WC-CPP</w:t>
+                  </w:r>
+                </w:p>
+              </w:tc>
+            </w:tr>
+            <w:tr>
+              <w:tc>
+                <w:tcPr>
+                  <w:gridSpan w:val="1"/>
+                  <w:vMerge w:val="continue"/>
+                </w:tcPr>
+                <w:p>
+                  <w:pPr/>
+                </w:p>
+              </w:tc>
+              <w:tc>
+                <w:tcPr/>
+                <w:p>
+                  <w:pPr>
+                    <w:pStyle w:val="Compact"/>
+                    <w:jc w:val="center"/>
+                  </w:pPr>
+                  <w:r>
+                    <w:t xml:space="preserve">Elution buffer pH</w:t>
+                  </w:r>
+                </w:p>
+              </w:tc>
+              <w:tc>
+                <w:tcPr/>
+                <w:p>
+                  <w:pPr>
+                    <w:pStyle w:val="Compact"/>
+                    <w:jc w:val="center"/>
+                  </w:pPr>
+                  <w:r>
+                    <w:t xml:space="preserve">pH</w:t>
+                  </w:r>
+                </w:p>
+              </w:tc>
+              <w:tc>
+                <w:tcPr/>
+                <w:p>
+                  <w:pPr>
+                    <w:pStyle w:val="Compact"/>
+                    <w:jc w:val="center"/>
+                  </w:pPr>
+                  <w:r>
+                    <w:t xml:space="preserve">6</w:t>
+                  </w:r>
+                </w:p>
+              </w:tc>
+              <w:tc>
+                <w:tcPr/>
+                <w:p>
+                  <w:pPr>
+                    <w:pStyle w:val="Compact"/>
+                    <w:jc w:val="center"/>
+                  </w:pPr>
+                  <w:r>
+                    <w:t xml:space="preserve">5.85–6.15</w:t>
+                  </w:r>
+                </w:p>
+              </w:tc>
+              <w:tc>
+                <w:tcPr/>
+                <w:p>
+                  <w:pPr>
+                    <w:pStyle w:val="Compact"/>
+                    <w:jc w:val="center"/>
+                  </w:pPr>
+                  <w:r>
+                    <w:t xml:space="preserve">5.8–6.2</w:t>
+                  </w:r>
+                </w:p>
+              </w:tc>
+              <w:tc>
+                <w:tcPr/>
+                <w:p>
+                  <w:pPr>
+                    <w:pStyle w:val="Compact"/>
+                    <w:jc w:val="center"/>
+                  </w:pPr>
+                  <w:r>
+                    <w:t xml:space="preserve">WC-CPP</w:t>
+                  </w:r>
+                </w:p>
+              </w:tc>
+            </w:tr>
+            <w:tr>
+              <w:tc>
+                <w:tcPr>
+                  <w:gridSpan w:val="1"/>
+                  <w:vMerge w:val="continue"/>
+                </w:tcPr>
+                <w:p>
+                  <w:pPr/>
+                </w:p>
+              </w:tc>
+              <w:tc>
+                <w:tcPr/>
+                <w:p>
+                  <w:pPr>
+                    <w:pStyle w:val="Compact"/>
+                    <w:jc w:val="center"/>
+                  </w:pPr>
+                  <w:r>
+                    <w:t xml:space="preserve">Elution stop collect</w:t>
+                  </w:r>
+                </w:p>
+              </w:tc>
+              <w:tc>
+                <w:tcPr/>
+                <w:p>
+                  <w:pPr>
+                    <w:pStyle w:val="Compact"/>
+                    <w:jc w:val="center"/>
+                  </w:pPr>
+                  <w:r>
+                    <w:t xml:space="preserve">AU (OD280, descending)</w:t>
+                  </w:r>
+                </w:p>
+              </w:tc>
+              <w:tc>
+                <w:tcPr/>
+                <w:p>
+                  <w:pPr>
+                    <w:pStyle w:val="Compact"/>
+                    <w:jc w:val="center"/>
+                  </w:pPr>
+                  <w:r>
+                    <w:t xml:space="preserve">1</w:t>
+                  </w:r>
+                </w:p>
+              </w:tc>
+              <w:tc>
+                <w:tcPr/>
+                <w:p>
+                  <w:pPr>
+                    <w:pStyle w:val="Compact"/>
+                    <w:jc w:val="center"/>
+                  </w:pPr>
+                  <w:r>
+                    <w:t xml:space="preserve">0.7–1.3</w:t>
+                  </w:r>
+                </w:p>
+              </w:tc>
+              <w:tc>
+                <w:tcPr/>
+                <w:p>
+                  <w:pPr>
+                    <w:pStyle w:val="Compact"/>
+                    <w:jc w:val="center"/>
+                  </w:pPr>
+                  <w:r>
+                    <w:t xml:space="preserve">0.5–1.5</w:t>
+                  </w:r>
+                </w:p>
+              </w:tc>
+              <w:tc>
+                <w:tcPr/>
+                <w:p>
+                  <w:pPr>
+                    <w:pStyle w:val="Compact"/>
+                    <w:jc w:val="center"/>
+                  </w:pPr>
+                  <w:r>
+                    <w:t xml:space="preserve">WC-CPP</w:t>
+                  </w:r>
+                </w:p>
+              </w:tc>
+            </w:tr>
+            <w:tr>
+              <w:tc>
+                <w:tcPr>
+                  <w:gridSpan w:val="1"/>
+                  <w:vMerge w:val="continue"/>
+                </w:tcPr>
+                <w:p>
+                  <w:pPr/>
+                </w:p>
+              </w:tc>
+              <w:tc>
+                <w:tcPr/>
+                <w:p>
+                  <w:pPr>
+                    <w:pStyle w:val="Compact"/>
+                    <w:jc w:val="center"/>
+                  </w:pPr>
+                  <w:r>
+                    <w:t xml:space="preserve">Elution flow rate</w:t>
                   </w:r>
                   <w:r>
                     <w:rPr>
@@ -9155,43 +10043,43 @@
                     <w:jc w:val="center"/>
                   </w:pPr>
                   <w:r>
-                    <w:t xml:space="preserve">°C</w:t>
-                  </w:r>
-                </w:p>
-              </w:tc>
-              <w:tc>
-                <w:tcPr/>
-                <w:p>
-                  <w:pPr>
-                    <w:pStyle w:val="Compact"/>
-                    <w:jc w:val="center"/>
-                  </w:pPr>
-                  <w:r>
-                    <w:t xml:space="preserve">22</w:t>
-                  </w:r>
-                </w:p>
-              </w:tc>
-              <w:tc>
-                <w:tcPr/>
-                <w:p>
-                  <w:pPr>
-                    <w:pStyle w:val="Compact"/>
-                    <w:jc w:val="center"/>
-                  </w:pPr>
-                  <w:r>
-                    <w:t xml:space="preserve">18–26</w:t>
-                  </w:r>
-                </w:p>
-              </w:tc>
-              <w:tc>
-                <w:tcPr/>
-                <w:p>
-                  <w:pPr>
-                    <w:pStyle w:val="Compact"/>
-                    <w:jc w:val="center"/>
-                  </w:pPr>
-                  <w:r>
-                    <w:t xml:space="preserve">15–30</w:t>
+                    <w:t xml:space="preserve">cm/hr</w:t>
+                  </w:r>
+                </w:p>
+              </w:tc>
+              <w:tc>
+                <w:tcPr/>
+                <w:p>
+                  <w:pPr>
+                    <w:pStyle w:val="Compact"/>
+                    <w:jc w:val="center"/>
+                  </w:pPr>
+                  <w:r>
+                    <w:t xml:space="preserve">200</w:t>
+                  </w:r>
+                </w:p>
+              </w:tc>
+              <w:tc>
+                <w:tcPr/>
+                <w:p>
+                  <w:pPr>
+                    <w:pStyle w:val="Compact"/>
+                    <w:jc w:val="center"/>
+                  </w:pPr>
+                  <w:r>
+                    <w:t xml:space="preserve">150–250</w:t>
+                  </w:r>
+                </w:p>
+              </w:tc>
+              <w:tc>
+                <w:tcPr/>
+                <w:p>
+                  <w:pPr>
+                    <w:pStyle w:val="Compact"/>
+                    <w:jc w:val="center"/>
+                  </w:pPr>
+                  <w:r>
+                    <w:t xml:space="preserve">100–300</w:t>
                   </w:r>
                 </w:p>
               </w:tc>
@@ -9204,6 +10092,94 @@
                   </w:pPr>
                   <w:r>
                     <w:t xml:space="preserve">GPP</w:t>
+                  </w:r>
+                </w:p>
+              </w:tc>
+            </w:tr>
+            <w:tr>
+              <w:tc>
+                <w:tcPr>
+                  <w:vMerge w:val="restart"/>
+                </w:tcPr>
+                <w:p>
+                  <w:pPr>
+                    <w:pStyle w:val="Compact"/>
+                    <w:jc w:val="center"/>
+                  </w:pPr>
+                  <w:r>
+                    <w:t xml:space="preserve">Anion exchange</w:t>
+                  </w:r>
+                </w:p>
+              </w:tc>
+              <w:tc>
+                <w:tcPr/>
+                <w:p>
+                  <w:pPr>
+                    <w:pStyle w:val="Compact"/>
+                    <w:jc w:val="center"/>
+                  </w:pPr>
+                  <w:r>
+                    <w:t xml:space="preserve">Load pH</w:t>
+                  </w:r>
+                </w:p>
+              </w:tc>
+              <w:tc>
+                <w:tcPr/>
+                <w:p>
+                  <w:pPr>
+                    <w:pStyle w:val="Compact"/>
+                    <w:jc w:val="center"/>
+                  </w:pPr>
+                  <w:r>
+                    <w:t xml:space="preserve">pH</w:t>
+                  </w:r>
+                </w:p>
+              </w:tc>
+              <w:tc>
+                <w:tcPr/>
+                <w:p>
+                  <w:pPr>
+                    <w:pStyle w:val="Compact"/>
+                    <w:jc w:val="center"/>
+                  </w:pPr>
+                  <w:r>
+                    <w:t xml:space="preserve">7.5</w:t>
+                  </w:r>
+                </w:p>
+              </w:tc>
+              <w:tc>
+                <w:tcPr/>
+                <w:p>
+                  <w:pPr>
+                    <w:pStyle w:val="Compact"/>
+                    <w:jc w:val="center"/>
+                  </w:pPr>
+                  <w:r>
+                    <w:t xml:space="preserve">7.35–7.65</w:t>
+                  </w:r>
+                </w:p>
+              </w:tc>
+              <w:tc>
+                <w:tcPr/>
+                <w:p>
+                  <w:pPr>
+                    <w:pStyle w:val="Compact"/>
+                    <w:jc w:val="center"/>
+                  </w:pPr>
+                  <w:r>
+                    <w:t xml:space="preserve">7.2–7.8</w:t>
+                  </w:r>
+                </w:p>
+              </w:tc>
+              <w:tc>
+                <w:tcPr/>
+                <w:p>
+                  <w:pPr>
+                    <w:pStyle w:val="Compact"/>
+                    <w:jc w:val="center"/>
+                  </w:pPr>
+                  <w:r>
+                    <w:t xml:space="preserve">WC-CPP</w:t>
                   </w:r>
                 </w:p>
               </w:tc>
@@ -9226,7 +10202,256 @@
                     <w:jc w:val="center"/>
                   </w:pPr>
                   <w:r>
-                    <w:t xml:space="preserve">Bed height</w:t>
+                    <w:t xml:space="preserve">Equil/Wash-1 conductivity</w:t>
+                  </w:r>
+                </w:p>
+              </w:tc>
+              <w:tc>
+                <w:tcPr/>
+                <w:p>
+                  <w:pPr>
+                    <w:pStyle w:val="Compact"/>
+                    <w:jc w:val="center"/>
+                  </w:pPr>
+                  <w:r>
+                    <w:t xml:space="preserve">mS/cm</w:t>
+                  </w:r>
+                </w:p>
+              </w:tc>
+              <w:tc>
+                <w:tcPr/>
+                <w:p>
+                  <w:pPr>
+                    <w:pStyle w:val="Compact"/>
+                    <w:jc w:val="center"/>
+                  </w:pPr>
+                  <w:r>
+                    <w:t xml:space="preserve">2.6</w:t>
+                  </w:r>
+                </w:p>
+              </w:tc>
+              <w:tc>
+                <w:tcPr/>
+                <w:p>
+                  <w:pPr>
+                    <w:pStyle w:val="Compact"/>
+                    <w:jc w:val="center"/>
+                  </w:pPr>
+                  <w:r>
+                    <w:t xml:space="preserve">2.1–3.1</w:t>
+                  </w:r>
+                </w:p>
+              </w:tc>
+              <w:tc>
+                <w:tcPr/>
+                <w:p>
+                  <w:pPr>
+                    <w:pStyle w:val="Compact"/>
+                    <w:jc w:val="center"/>
+                  </w:pPr>
+                  <w:r>
+                    <w:t xml:space="preserve">1.6–3.6</w:t>
+                  </w:r>
+                </w:p>
+              </w:tc>
+              <w:tc>
+                <w:tcPr/>
+                <w:p>
+                  <w:pPr>
+                    <w:pStyle w:val="Compact"/>
+                    <w:jc w:val="center"/>
+                  </w:pPr>
+                  <w:r>
+                    <w:t xml:space="preserve">WC-CPP</w:t>
+                  </w:r>
+                </w:p>
+              </w:tc>
+            </w:tr>
+            <w:tr>
+              <w:tc>
+                <w:tcPr>
+                  <w:gridSpan w:val="1"/>
+                  <w:vMerge w:val="continue"/>
+                </w:tcPr>
+                <w:p>
+                  <w:pPr/>
+                </w:p>
+              </w:tc>
+              <w:tc>
+                <w:tcPr/>
+                <w:p>
+                  <w:pPr>
+                    <w:pStyle w:val="Compact"/>
+                    <w:jc w:val="center"/>
+                  </w:pPr>
+                  <w:r>
+                    <w:t xml:space="preserve">Load conductivity</w:t>
+                  </w:r>
+                </w:p>
+              </w:tc>
+              <w:tc>
+                <w:tcPr/>
+                <w:p>
+                  <w:pPr>
+                    <w:pStyle w:val="Compact"/>
+                    <w:jc w:val="center"/>
+                  </w:pPr>
+                  <w:r>
+                    <w:t xml:space="preserve">mS/cm</w:t>
+                  </w:r>
+                </w:p>
+              </w:tc>
+              <w:tc>
+                <w:tcPr/>
+                <w:p>
+                  <w:pPr>
+                    <w:pStyle w:val="Compact"/>
+                    <w:jc w:val="center"/>
+                  </w:pPr>
+                  <w:r>
+                    <w:t xml:space="preserve">5.5</w:t>
+                  </w:r>
+                </w:p>
+              </w:tc>
+              <w:tc>
+                <w:tcPr/>
+                <w:p>
+                  <w:pPr>
+                    <w:pStyle w:val="Compact"/>
+                    <w:jc w:val="center"/>
+                  </w:pPr>
+                  <w:r>
+                    <w:t xml:space="preserve">4–7</w:t>
+                  </w:r>
+                </w:p>
+              </w:tc>
+              <w:tc>
+                <w:tcPr/>
+                <w:p>
+                  <w:pPr>
+                    <w:pStyle w:val="Compact"/>
+                    <w:jc w:val="center"/>
+                  </w:pPr>
+                  <w:r>
+                    <w:t xml:space="preserve">3–8</w:t>
+                  </w:r>
+                </w:p>
+              </w:tc>
+              <w:tc>
+                <w:tcPr/>
+                <w:p>
+                  <w:pPr>
+                    <w:pStyle w:val="Compact"/>
+                    <w:jc w:val="center"/>
+                  </w:pPr>
+                  <w:r>
+                    <w:t xml:space="preserve">WC-CPP</w:t>
+                  </w:r>
+                </w:p>
+              </w:tc>
+            </w:tr>
+            <w:tr>
+              <w:tc>
+                <w:tcPr>
+                  <w:gridSpan w:val="1"/>
+                  <w:vMerge w:val="continue"/>
+                </w:tcPr>
+                <w:p>
+                  <w:pPr/>
+                </w:p>
+              </w:tc>
+              <w:tc>
+                <w:tcPr/>
+                <w:p>
+                  <w:pPr>
+                    <w:pStyle w:val="Compact"/>
+                    <w:jc w:val="center"/>
+                  </w:pPr>
+                  <w:r>
+                    <w:t xml:space="preserve">Protein load</w:t>
+                  </w:r>
+                </w:p>
+              </w:tc>
+              <w:tc>
+                <w:tcPr/>
+                <w:p>
+                  <w:pPr>
+                    <w:pStyle w:val="Compact"/>
+                    <w:jc w:val="center"/>
+                  </w:pPr>
+                  <w:r>
+                    <w:t xml:space="preserve">g/L resin</w:t>
+                  </w:r>
+                </w:p>
+              </w:tc>
+              <w:tc>
+                <w:tcPr/>
+                <w:p>
+                  <w:pPr>
+                    <w:pStyle w:val="Compact"/>
+                    <w:jc w:val="center"/>
+                  </w:pPr>
+                  <w:r>
+                    <w:t xml:space="preserve">200</w:t>
+                  </w:r>
+                </w:p>
+              </w:tc>
+              <w:tc>
+                <w:tcPr/>
+                <w:p>
+                  <w:pPr>
+                    <w:pStyle w:val="Compact"/>
+                    <w:jc w:val="center"/>
+                  </w:pPr>
+                  <w:r>
+                    <w:t xml:space="preserve">120–280</w:t>
+                  </w:r>
+                </w:p>
+              </w:tc>
+              <w:tc>
+                <w:tcPr/>
+                <w:p>
+                  <w:pPr>
+                    <w:pStyle w:val="Compact"/>
+                    <w:jc w:val="center"/>
+                  </w:pPr>
+                  <w:r>
+                    <w:t xml:space="preserve">50–300</w:t>
+                  </w:r>
+                </w:p>
+              </w:tc>
+              <w:tc>
+                <w:tcPr/>
+                <w:p>
+                  <w:pPr>
+                    <w:pStyle w:val="Compact"/>
+                    <w:jc w:val="center"/>
+                  </w:pPr>
+                  <w:r>
+                    <w:t xml:space="preserve">WC-CPP</w:t>
+                  </w:r>
+                </w:p>
+              </w:tc>
+            </w:tr>
+            <w:tr>
+              <w:tc>
+                <w:tcPr>
+                  <w:gridSpan w:val="1"/>
+                  <w:vMerge w:val="continue"/>
+                </w:tcPr>
+                <w:p>
+                  <w:pPr/>
+                </w:p>
+              </w:tc>
+              <w:tc>
+                <w:tcPr/>
+                <w:p>
+                  <w:pPr>
+                    <w:pStyle w:val="Compact"/>
+                    <w:jc w:val="center"/>
+                  </w:pPr>
+                  <w:r>
+                    <w:t xml:space="preserve">Operating flow rate</w:t>
                   </w:r>
                   <w:r>
                     <w:rPr>
@@ -9244,55 +10469,55 @@
                     <w:jc w:val="center"/>
                   </w:pPr>
                   <w:r>
-                    <w:t xml:space="preserve">cm</w:t>
-                  </w:r>
-                </w:p>
-              </w:tc>
-              <w:tc>
-                <w:tcPr/>
-                <w:p>
-                  <w:pPr>
-                    <w:pStyle w:val="Compact"/>
-                    <w:jc w:val="center"/>
-                  </w:pPr>
-                  <w:r>
-                    <w:t xml:space="preserve">20</w:t>
-                  </w:r>
-                </w:p>
-              </w:tc>
-              <w:tc>
-                <w:tcPr/>
-                <w:p>
-                  <w:pPr>
-                    <w:pStyle w:val="Compact"/>
-                    <w:jc w:val="center"/>
-                  </w:pPr>
-                  <w:r>
-                    <w:t xml:space="preserve">15–25</w:t>
-                  </w:r>
-                </w:p>
-              </w:tc>
-              <w:tc>
-                <w:tcPr/>
-                <w:p>
-                  <w:pPr>
-                    <w:pStyle w:val="Compact"/>
-                    <w:jc w:val="center"/>
-                  </w:pPr>
-                  <w:r>
-                    <w:t xml:space="preserve">10–30</w:t>
-                  </w:r>
-                </w:p>
-              </w:tc>
-              <w:tc>
-                <w:tcPr/>
-                <w:p>
-                  <w:pPr>
-                    <w:pStyle w:val="Compact"/>
-                    <w:jc w:val="center"/>
-                  </w:pPr>
-                  <w:r>
-                    <w:t xml:space="preserve">GPP</w:t>
+                    <w:t xml:space="preserve">cm/hr</w:t>
+                  </w:r>
+                </w:p>
+              </w:tc>
+              <w:tc>
+                <w:tcPr/>
+                <w:p>
+                  <w:pPr>
+                    <w:pStyle w:val="Compact"/>
+                    <w:jc w:val="center"/>
+                  </w:pPr>
+                  <w:r>
+                    <w:t xml:space="preserve">300</w:t>
+                  </w:r>
+                </w:p>
+              </w:tc>
+              <w:tc>
+                <w:tcPr/>
+                <w:p>
+                  <w:pPr>
+                    <w:pStyle w:val="Compact"/>
+                    <w:jc w:val="center"/>
+                  </w:pPr>
+                  <w:r>
+                    <w:t xml:space="preserve">200–400</w:t>
+                  </w:r>
+                </w:p>
+              </w:tc>
+              <w:tc>
+                <w:tcPr/>
+                <w:p>
+                  <w:pPr>
+                    <w:pStyle w:val="Compact"/>
+                    <w:jc w:val="center"/>
+                  </w:pPr>
+                  <w:r>
+                    <w:t xml:space="preserve">150–450</w:t>
+                  </w:r>
+                </w:p>
+              </w:tc>
+              <w:tc>
+                <w:tcPr/>
+                <w:p>
+                  <w:pPr>
+                    <w:pStyle w:val="Compact"/>
+                    <w:jc w:val="center"/>
+                  </w:pPr>
+                  <w:r>
+                    <w:t xml:space="preserve">WC-CPP</w:t>
                   </w:r>
                 </w:p>
               </w:tc>
@@ -9308,91 +10533,615 @@
                     <w:jc w:val="center"/>
                   </w:pPr>
                   <w:r>
-                    <w:t xml:space="preserve">Low-pH viral inactivation</w:t>
-                  </w:r>
-                </w:p>
-              </w:tc>
-              <w:tc>
-                <w:tcPr/>
-                <w:p>
-                  <w:pPr>
-                    <w:pStyle w:val="Compact"/>
-                    <w:jc w:val="center"/>
-                  </w:pPr>
-                  <w:r>
-                    <w:t xml:space="preserve">Inactivation pH</w:t>
-                  </w:r>
-                </w:p>
-              </w:tc>
-              <w:tc>
-                <w:tcPr/>
-                <w:p>
-                  <w:pPr>
-                    <w:pStyle w:val="Compact"/>
-                    <w:jc w:val="center"/>
-                  </w:pPr>
-                  <w:r>
-                    <w:t xml:space="preserve">pH</w:t>
-                  </w:r>
-                </w:p>
-              </w:tc>
-              <w:tc>
-                <w:tcPr/>
-                <w:p>
-                  <w:pPr>
-                    <w:pStyle w:val="Compact"/>
-                    <w:jc w:val="center"/>
-                  </w:pPr>
-                  <w:r>
-                    <w:t xml:space="preserve">3.4</w:t>
-                  </w:r>
+                    <w:t xml:space="preserve">Virus filtration</w:t>
+                  </w:r>
+                </w:p>
+              </w:tc>
+              <w:tc>
+                <w:tcPr/>
+                <w:p>
+                  <w:pPr>
+                    <w:pStyle w:val="Compact"/>
+                    <w:jc w:val="center"/>
+                  </w:pPr>
+                  <w:r>
+                    <w:t xml:space="preserve">Filtration volume (load)</w:t>
+                  </w:r>
+                </w:p>
+              </w:tc>
+              <w:tc>
+                <w:tcPr/>
+                <w:p>
+                  <w:pPr>
+                    <w:pStyle w:val="Compact"/>
+                    <w:jc w:val="center"/>
+                  </w:pPr>
+                  <w:r>
+                    <w:t xml:space="preserve">L/m2</w:t>
+                  </w:r>
+                </w:p>
+              </w:tc>
+              <w:tc>
+                <w:tcPr/>
+                <w:p>
+                  <w:pPr>
+                    <w:pStyle w:val="Compact"/>
+                    <w:jc w:val="center"/>
+                  </w:pPr>
+                  <w:r>
+                    <w:t xml:space="preserve">90</w:t>
+                  </w:r>
+                </w:p>
+              </w:tc>
+              <w:tc>
+                <w:tcPr/>
+                <w:p>
+                  <w:pPr>
+                    <w:pStyle w:val="Compact"/>
+                    <w:jc w:val="center"/>
+                  </w:pPr>
+                  <w:r>
+                    <w:t xml:space="preserve">50–105</w:t>
+                  </w:r>
+                </w:p>
+              </w:tc>
+              <w:tc>
+                <w:tcPr/>
+                <w:p>
+                  <w:pPr>
+                    <w:pStyle w:val="Compact"/>
+                    <w:jc w:val="center"/>
+                  </w:pPr>
+                  <w:r>
+                    <w:t xml:space="preserve">50–140</w:t>
+                  </w:r>
+                </w:p>
+              </w:tc>
+              <w:tc>
+                <w:tcPr/>
+                <w:p>
+                  <w:pPr>
+                    <w:pStyle w:val="Compact"/>
+                    <w:jc w:val="center"/>
+                  </w:pPr>
+                  <w:r>
+                    <w:t xml:space="preserve">WC-CPP</w:t>
+                  </w:r>
+                </w:p>
+              </w:tc>
+            </w:tr>
+            <w:tr>
+              <w:tc>
+                <w:tcPr>
+                  <w:gridSpan w:val="1"/>
+                  <w:vMerge w:val="continue"/>
+                </w:tcPr>
+                <w:p>
+                  <w:pPr/>
+                </w:p>
+              </w:tc>
+              <w:tc>
+                <w:tcPr/>
+                <w:p>
+                  <w:pPr>
+                    <w:pStyle w:val="Compact"/>
+                    <w:jc w:val="center"/>
+                  </w:pPr>
+                  <w:r>
+                    <w:t xml:space="preserve">Filtration pressure</w:t>
+                  </w:r>
+                </w:p>
+              </w:tc>
+              <w:tc>
+                <w:tcPr/>
+                <w:p>
+                  <w:pPr>
+                    <w:pStyle w:val="Compact"/>
+                    <w:jc w:val="center"/>
+                  </w:pPr>
+                  <w:r>
+                    <w:t xml:space="preserve">psi</w:t>
+                  </w:r>
+                </w:p>
+              </w:tc>
+              <w:tc>
+                <w:tcPr/>
+                <w:p>
+                  <w:pPr>
+                    <w:pStyle w:val="Compact"/>
+                    <w:jc w:val="center"/>
+                  </w:pPr>
+                  <w:r>
+                    <w:t xml:space="preserve">13</w:t>
+                  </w:r>
+                </w:p>
+              </w:tc>
+              <w:tc>
+                <w:tcPr/>
+                <w:p>
+                  <w:pPr>
+                    <w:pStyle w:val="Compact"/>
+                    <w:jc w:val="center"/>
+                  </w:pPr>
+                  <w:r>
+                    <w:t xml:space="preserve">10–20</w:t>
+                  </w:r>
+                </w:p>
+              </w:tc>
+              <w:tc>
+                <w:tcPr/>
+                <w:p>
+                  <w:pPr>
+                    <w:pStyle w:val="Compact"/>
+                    <w:jc w:val="center"/>
+                  </w:pPr>
+                  <w:r>
+                    <w:t xml:space="preserve">8–30</w:t>
+                  </w:r>
+                </w:p>
+              </w:tc>
+              <w:tc>
+                <w:tcPr/>
+                <w:p>
+                  <w:pPr>
+                    <w:pStyle w:val="Compact"/>
+                    <w:jc w:val="center"/>
+                  </w:pPr>
+                  <w:r>
+                    <w:t xml:space="preserve">WC-CPP</w:t>
+                  </w:r>
+                </w:p>
+              </w:tc>
+            </w:tr>
+            <w:tr>
+              <w:tc>
+                <w:tcPr>
+                  <w:vMerge w:val="restart"/>
+                </w:tcPr>
+                <w:p>
+                  <w:pPr>
+                    <w:pStyle w:val="Compact"/>
+                    <w:jc w:val="center"/>
+                  </w:pPr>
+                  <w:r>
+                    <w:t xml:space="preserve">UF/DF</w:t>
+                  </w:r>
+                </w:p>
+              </w:tc>
+              <w:tc>
+                <w:tcPr/>
+                <w:p>
+                  <w:pPr>
+                    <w:pStyle w:val="Compact"/>
+                    <w:jc w:val="center"/>
+                  </w:pPr>
+                  <w:r>
+                    <w:t xml:space="preserve">Number of diavolumes</w:t>
+                  </w:r>
+                  <w:r>
+                    <w:rPr>
+                      <w:vertAlign w:val="superscript"/>
+                    </w:rPr>
+                    <w:t xml:space="preserve">a)</w:t>
+                  </w:r>
+                </w:p>
+              </w:tc>
+              <w:tc>
+                <w:tcPr/>
+                <w:p>
+                  <w:pPr>
+                    <w:pStyle w:val="Compact"/>
+                    <w:jc w:val="center"/>
+                  </w:pPr>
+                  <w:r>
+                    <w:t xml:space="preserve">DV</w:t>
+                  </w:r>
+                </w:p>
+              </w:tc>
+              <w:tc>
+                <w:tcPr/>
+                <w:p>
+                  <w:pPr>
+                    <w:pStyle w:val="Compact"/>
+                    <w:jc w:val="center"/>
+                  </w:pPr>
+                  <w:r>
+                    <w:t xml:space="preserve">8</w:t>
+                  </w:r>
+                </w:p>
+              </w:tc>
+              <w:tc>
+                <w:tcPr/>
+                <w:p>
+                  <w:pPr>
+                    <w:pStyle w:val="Compact"/>
+                    <w:jc w:val="center"/>
+                  </w:pPr>
+                  <w:r>
+                    <w:t xml:space="preserve">≥ 7</w:t>
+                  </w:r>
+                  <w:r>
+                    <w:rPr>
+                      <w:vertAlign w:val="superscript"/>
+                    </w:rPr>
+                    <w:t xml:space="preserve">c)</w:t>
+                  </w:r>
+                </w:p>
+              </w:tc>
+              <w:tc>
+                <w:tcPr/>
+                <w:p>
+                  <w:pPr>
+                    <w:pStyle w:val="Compact"/>
+                    <w:jc w:val="center"/>
+                  </w:pPr>
+                  <w:r>
+                    <w:t xml:space="preserve">7–10</w:t>
+                  </w:r>
+                </w:p>
+              </w:tc>
+              <w:tc>
+                <w:tcPr/>
+                <w:p>
+                  <w:pPr>
+                    <w:pStyle w:val="Compact"/>
+                    <w:jc w:val="center"/>
+                  </w:pPr>
+                  <w:r>
+                    <w:t xml:space="preserve">KPP</w:t>
+                  </w:r>
+                </w:p>
+              </w:tc>
+            </w:tr>
+            <w:tr>
+              <w:tc>
+                <w:tcPr>
+                  <w:gridSpan w:val="1"/>
+                  <w:vMerge w:val="continue"/>
+                </w:tcPr>
+                <w:p>
+                  <w:pPr/>
+                </w:p>
+              </w:tc>
+              <w:tc>
+                <w:tcPr/>
+                <w:p>
+                  <w:pPr>
+                    <w:pStyle w:val="Compact"/>
+                    <w:jc w:val="center"/>
+                  </w:pPr>
+                  <w:r>
+                    <w:t xml:space="preserve">Transmembrane pressure</w:t>
+                  </w:r>
+                  <w:r>
+                    <w:rPr>
+                      <w:vertAlign w:val="superscript"/>
+                    </w:rPr>
+                    <w:t xml:space="preserve">a)</w:t>
+                  </w:r>
+                </w:p>
+              </w:tc>
+              <w:tc>
+                <w:tcPr/>
+                <w:p>
+                  <w:pPr>
+                    <w:pStyle w:val="Compact"/>
+                    <w:jc w:val="center"/>
+                  </w:pPr>
+                  <w:r>
+                    <w:t xml:space="preserve">psi</w:t>
+                  </w:r>
+                </w:p>
+              </w:tc>
+              <w:tc>
+                <w:tcPr/>
+                <w:p>
+                  <w:pPr>
+                    <w:pStyle w:val="Compact"/>
+                    <w:jc w:val="center"/>
+                  </w:pPr>
+                  <w:r>
+                    <w:t xml:space="preserve">12</w:t>
+                  </w:r>
+                </w:p>
+              </w:tc>
+              <w:tc>
+                <w:tcPr/>
+                <w:p>
+                  <w:pPr>
+                    <w:pStyle w:val="Compact"/>
+                    <w:jc w:val="center"/>
+                  </w:pPr>
+                  <w:r>
+                    <w:t xml:space="preserve">10–14</w:t>
+                  </w:r>
+                </w:p>
+              </w:tc>
+              <w:tc>
+                <w:tcPr/>
+                <w:p>
+                  <w:pPr>
+                    <w:pStyle w:val="Compact"/>
+                    <w:jc w:val="center"/>
+                  </w:pPr>
+                  <w:r>
+                    <w:t xml:space="preserve">10–15</w:t>
+                  </w:r>
+                </w:p>
+              </w:tc>
+              <w:tc>
+                <w:tcPr/>
+                <w:p>
+                  <w:pPr>
+                    <w:pStyle w:val="Compact"/>
+                    <w:jc w:val="center"/>
+                  </w:pPr>
+                  <w:r>
+                    <w:t xml:space="preserve">KPP</w:t>
+                  </w:r>
+                </w:p>
+              </w:tc>
+            </w:tr>
+            <w:tr>
+              <w:tc>
+                <w:tcPr>
+                  <w:gridSpan w:val="1"/>
+                  <w:vMerge w:val="continue"/>
+                </w:tcPr>
+                <w:p>
+                  <w:pPr/>
+                </w:p>
+              </w:tc>
+              <w:tc>
+                <w:tcPr/>
+                <w:p>
+                  <w:pPr>
+                    <w:pStyle w:val="Compact"/>
+                    <w:jc w:val="center"/>
+                  </w:pPr>
+                  <w:r>
+                    <w:t xml:space="preserve">Final DS concentration</w:t>
+                  </w:r>
+                  <w:r>
+                    <w:rPr>
+                      <w:vertAlign w:val="superscript"/>
+                    </w:rPr>
+                    <w:t xml:space="preserve">a)</w:t>
+                  </w:r>
+                </w:p>
+              </w:tc>
+              <w:tc>
+                <w:tcPr/>
+                <w:p>
+                  <w:pPr>
+                    <w:pStyle w:val="Compact"/>
+                    <w:jc w:val="center"/>
+                  </w:pPr>
+                  <w:r>
+                    <w:t xml:space="preserve">g/L</w:t>
+                  </w:r>
+                </w:p>
+              </w:tc>
+              <w:tc>
+                <w:tcPr/>
+                <w:p>
+                  <w:pPr>
+                    <w:pStyle w:val="Compact"/>
+                    <w:jc w:val="center"/>
+                  </w:pPr>
+                  <w:r>
+                    <w:t xml:space="preserve">75</w:t>
+                  </w:r>
+                </w:p>
+              </w:tc>
+              <w:tc>
+                <w:tcPr/>
+                <w:p>
+                  <w:pPr>
+                    <w:pStyle w:val="Compact"/>
+                    <w:jc w:val="center"/>
+                  </w:pPr>
+                  <w:r>
+                    <w:t xml:space="preserve">70–80</w:t>
+                  </w:r>
+                </w:p>
+              </w:tc>
+              <w:tc>
+                <w:tcPr/>
+                <w:p>
+                  <w:pPr>
+                    <w:pStyle w:val="Compact"/>
+                    <w:jc w:val="center"/>
+                  </w:pPr>
+                  <w:r>
+                    <w:t xml:space="preserve">65–85</w:t>
+                  </w:r>
+                </w:p>
+              </w:tc>
+              <w:tc>
+                <w:tcPr/>
+                <w:p>
+                  <w:pPr>
+                    <w:pStyle w:val="Compact"/>
+                    <w:jc w:val="center"/>
+                  </w:pPr>
+                  <w:r>
+                    <w:t xml:space="preserve">KPP</w:t>
+                  </w:r>
+                </w:p>
+              </w:tc>
+            </w:tr>
+            <w:tr>
+              <w:tc>
+                <w:tcPr>
+                  <w:gridSpan w:val="7"/>
+                </w:tcPr>
+                <w:p>
+                  <w:pPr>
+                    <w:pStyle w:val="Compact"/>
+                    <w:jc w:val="center"/>
+                  </w:pPr>
+                  <w:r>
+                    <w:rPr>
+                      <w:vertAlign w:val="superscript"/>
+                    </w:rPr>
+                    <w:t xml:space="preserve">a)</w:t>
+                  </w:r>
+                  <w:r>
+                    <w:t xml:space="preserve"> </w:t>
+                  </w:r>
+                  <w:r>
+                    <w:t xml:space="preserve">Studied one factor at a time. Every other parameter was studied in the designed experiments of its step.</w:t>
+                  </w:r>
+                </w:p>
+              </w:tc>
+            </w:tr>
+            <w:tr>
+              <w:tc>
+                <w:tcPr>
+                  <w:gridSpan w:val="7"/>
+                </w:tcPr>
+                <w:p>
+                  <w:pPr>
+                    <w:pStyle w:val="Compact"/>
+                    <w:jc w:val="center"/>
+                  </w:pPr>
+                  <w:r>
+                    <w:rPr>
+                      <w:vertAlign w:val="superscript"/>
+                    </w:rPr>
+                    <w:t xml:space="preserve">b)</w:t>
+                  </w:r>
+                  <w:r>
+                    <w:t xml:space="preserve"> </w:t>
+                  </w:r>
+                  <w:r>
+                    <w:t xml:space="preserve">The normal operating range equals the characterized range.</w:t>
+                  </w:r>
+                </w:p>
+              </w:tc>
+            </w:tr>
+            <w:tr>
+              <w:tc>
+                <w:tcPr>
+                  <w:gridSpan w:val="7"/>
+                </w:tcPr>
+                <w:p>
+                  <w:pPr>
+                    <w:pStyle w:val="Compact"/>
+                    <w:jc w:val="center"/>
+                  </w:pPr>
+                  <w:r>
+                    <w:rPr>
+                      <w:vertAlign w:val="superscript"/>
+                    </w:rPr>
+                    <w:t xml:space="preserve">c)</w:t>
+                  </w:r>
+                  <w:r>
+                    <w:t xml:space="preserve"> </w:t>
+                  </w:r>
+                  <w:r>
+                    <w:t xml:space="preserve">A minimum: the parameter is counted to its target and is not run below this value.</w:t>
+                  </w:r>
+                </w:p>
+              </w:tc>
+            </w:tr>
+            <w:tr>
+              <w:tc>
+                <w:tcPr>
+                  <w:gridSpan w:val="7"/>
+                </w:tcPr>
+                <w:p>
+                  <w:pPr>
+                    <w:pStyle w:val="Compact"/>
+                    <w:jc w:val="center"/>
+                  </w:pPr>
+                  <w:r>
+                    <w:rPr>
+                      <w:vertAlign w:val="superscript"/>
+                    </w:rPr>
+                    <w:t xml:space="preserve">c1)</w:t>
+                  </w:r>
+                  <w:r>
+                    <w:t xml:space="preserve"> </w:t>
+                  </w:r>
+                  <w:r>
+                    <w:t xml:space="preserve">Moved at Version 2.0 from pH 3.4–3.6, the NOR as characterized (PCR-006).</w:t>
+                  </w:r>
+                </w:p>
+              </w:tc>
+            </w:tr>
+            <w:tr>
+              <w:tc>
+                <w:tcPr>
+                  <w:gridSpan w:val="7"/>
+                </w:tcPr>
+                <w:p>
+                  <w:pPr>
+                    <w:pStyle w:val="Compact"/>
+                    <w:jc w:val="center"/>
+                  </w:pPr>
+                  <w:r>
+                    <w:rPr>
+                      <w:vertAlign w:val="superscript"/>
+                    </w:rPr>
+                    <w:t xml:space="preserve">c2)</w:t>
+                  </w:r>
+                  <w:r>
+                    <w:t xml:space="preserve"> </w:t>
+                  </w:r>
+                  <w:r>
+                    <w:t xml:space="preserve">Moved at Version 2.0 from pH 3.5, the set-point in the characterization plan (PCR-006).</w:t>
+                  </w:r>
+                </w:p>
+              </w:tc>
+            </w:tr>
+            <w:tr>
+              <w:tc>
+                <w:tcPr>
+                  <w:gridSpan w:val="7"/>
+                </w:tcPr>
+                <w:p>
+                  <w:pPr>
+                    <w:pStyle w:val="Compact"/>
+                    <w:jc w:val="center"/>
+                  </w:pPr>
                   <w:r>
                     <w:rPr>
                       <w:vertAlign w:val="superscript"/>
                     </w:rPr>
                     <w:t xml:space="preserve">c3)</w:t>
                   </w:r>
-                </w:p>
-              </w:tc>
-              <w:tc>
-                <w:tcPr/>
-                <w:p>
-                  <w:pPr>
-                    <w:pStyle w:val="Compact"/>
-                    <w:jc w:val="center"/>
-                  </w:pPr>
-                  <w:r>
-                    <w:t xml:space="preserve">3.3–3.5</w:t>
-                  </w:r>
+                  <w:r>
+                    <w:t xml:space="preserve"> </w:t>
+                  </w:r>
+                  <w:r>
+                    <w:t xml:space="preserve">Narrowed at Version 2.0 from 60–120 min, the NOR as characterized (PCR-006).</w:t>
+                  </w:r>
+                </w:p>
+              </w:tc>
+            </w:tr>
+            <w:tr>
+              <w:tc>
+                <w:tcPr>
+                  <w:gridSpan w:val="7"/>
+                </w:tcPr>
+                <w:p>
+                  <w:pPr>
+                    <w:pStyle w:val="Compact"/>
+                    <w:jc w:val="center"/>
+                  </w:pPr>
                   <w:r>
                     <w:rPr>
                       <w:vertAlign w:val="superscript"/>
                     </w:rPr>
-                    <w:t xml:space="preserve">c2)</w:t>
-                  </w:r>
-                </w:p>
-              </w:tc>
-              <w:tc>
-                <w:tcPr/>
-                <w:p>
-                  <w:pPr>
-                    <w:pStyle w:val="Compact"/>
-                    <w:jc w:val="center"/>
-                  </w:pPr>
-                  <w:r>
-                    <w:t xml:space="preserve">3.2–4</w:t>
-                  </w:r>
-                </w:p>
-              </w:tc>
-              <w:tc>
-                <w:tcPr/>
-                <w:p>
-                  <w:pPr>
-                    <w:pStyle w:val="Compact"/>
-                    <w:jc w:val="center"/>
-                  </w:pPr>
-                  <w:r>
-                    <w:t xml:space="preserve">CPP</w:t>
+                    <w:t xml:space="preserve">c4)</w:t>
+                  </w:r>
+                  <w:r>
+                    <w:t xml:space="preserve"> </w:t>
+                  </w:r>
+                  <w:r>
+                    <w:t xml:space="preserve">Moved at Version 2.0 from 90 min, the set-point in the characterization plan (PCR-006).</w:t>
                   </w:r>
                 </w:p>
               </w:tc>
@@ -9400,1767 +11149,18 @@
             <w:tr>
               <w:tc>
                 <w:tcPr>
-                  <w:gridSpan w:val="1"/>
-                  <w:vMerge w:val="continue"/>
+                  <w:gridSpan w:val="7"/>
                 </w:tcPr>
                 <w:p>
-                  <w:pPr/>
-                </w:p>
-              </w:tc>
-              <w:tc>
-                <w:tcPr/>
-                <w:p>
-                  <w:pPr>
-                    <w:pStyle w:val="Compact"/>
-                    <w:jc w:val="center"/>
-                  </w:pPr>
-                  <w:r>
-                    <w:t xml:space="preserve">Hold time</w:t>
-                  </w:r>
-                </w:p>
-              </w:tc>
-              <w:tc>
-                <w:tcPr/>
-                <w:p>
-                  <w:pPr>
-                    <w:pStyle w:val="Compact"/>
-                    <w:jc w:val="center"/>
-                  </w:pPr>
-                  <w:r>
-                    <w:t xml:space="preserve">min</w:t>
-                  </w:r>
-                </w:p>
-              </w:tc>
-              <w:tc>
-                <w:tcPr/>
-                <w:p>
-                  <w:pPr>
-                    <w:pStyle w:val="Compact"/>
-                    <w:jc w:val="center"/>
-                  </w:pPr>
-                  <w:r>
-                    <w:t xml:space="preserve">110</w:t>
-                  </w:r>
+                  <w:pPr>
+                    <w:pStyle w:val="Compact"/>
+                    <w:jc w:val="center"/>
+                  </w:pPr>
                   <w:r>
                     <w:rPr>
                       <w:vertAlign w:val="superscript"/>
                     </w:rPr>
                     <w:t xml:space="preserve">c5)</w:t>
-                  </w:r>
-                </w:p>
-              </w:tc>
-              <w:tc>
-                <w:tcPr/>
-                <w:p>
-                  <w:pPr>
-                    <w:pStyle w:val="Compact"/>
-                    <w:jc w:val="center"/>
-                  </w:pPr>
-                  <w:r>
-                    <w:t xml:space="preserve">100–120</w:t>
-                  </w:r>
-                  <w:r>
-                    <w:rPr>
-                      <w:vertAlign w:val="superscript"/>
-                    </w:rPr>
-                    <w:t xml:space="preserve">c4)</w:t>
-                  </w:r>
-                </w:p>
-              </w:tc>
-              <w:tc>
-                <w:tcPr/>
-                <w:p>
-                  <w:pPr>
-                    <w:pStyle w:val="Compact"/>
-                    <w:jc w:val="center"/>
-                  </w:pPr>
-                  <w:r>
-                    <w:t xml:space="preserve">60–180</w:t>
-                  </w:r>
-                </w:p>
-              </w:tc>
-              <w:tc>
-                <w:tcPr/>
-                <w:p>
-                  <w:pPr>
-                    <w:pStyle w:val="Compact"/>
-                    <w:jc w:val="center"/>
-                  </w:pPr>
-                  <w:r>
-                    <w:t xml:space="preserve">WC-CPP</w:t>
-                  </w:r>
-                </w:p>
-              </w:tc>
-            </w:tr>
-            <w:tr>
-              <w:tc>
-                <w:tcPr>
-                  <w:gridSpan w:val="1"/>
-                  <w:vMerge w:val="continue"/>
-                </w:tcPr>
-                <w:p>
-                  <w:pPr/>
-                </w:p>
-              </w:tc>
-              <w:tc>
-                <w:tcPr/>
-                <w:p>
-                  <w:pPr>
-                    <w:pStyle w:val="Compact"/>
-                    <w:jc w:val="center"/>
-                  </w:pPr>
-                  <w:r>
-                    <w:t xml:space="preserve">Temperature</w:t>
-                  </w:r>
-                </w:p>
-              </w:tc>
-              <w:tc>
-                <w:tcPr/>
-                <w:p>
-                  <w:pPr>
-                    <w:pStyle w:val="Compact"/>
-                    <w:jc w:val="center"/>
-                  </w:pPr>
-                  <w:r>
-                    <w:t xml:space="preserve">°C</w:t>
-                  </w:r>
-                </w:p>
-              </w:tc>
-              <w:tc>
-                <w:tcPr/>
-                <w:p>
-                  <w:pPr>
-                    <w:pStyle w:val="Compact"/>
-                    <w:jc w:val="center"/>
-                  </w:pPr>
-                  <w:r>
-                    <w:t xml:space="preserve">21</w:t>
-                  </w:r>
-                </w:p>
-              </w:tc>
-              <w:tc>
-                <w:tcPr/>
-                <w:p>
-                  <w:pPr>
-                    <w:pStyle w:val="Compact"/>
-                    <w:jc w:val="center"/>
-                  </w:pPr>
-                  <w:r>
-                    <w:t xml:space="preserve">20–23</w:t>
-                  </w:r>
-                  <w:r>
-                    <w:rPr>
-                      <w:vertAlign w:val="superscript"/>
-                    </w:rPr>
-                    <w:t xml:space="preserve">c6)</w:t>
-                  </w:r>
-                </w:p>
-              </w:tc>
-              <w:tc>
-                <w:tcPr/>
-                <w:p>
-                  <w:pPr>
-                    <w:pStyle w:val="Compact"/>
-                    <w:jc w:val="center"/>
-                  </w:pPr>
-                  <w:r>
-                    <w:t xml:space="preserve">15–25</w:t>
-                  </w:r>
-                </w:p>
-              </w:tc>
-              <w:tc>
-                <w:tcPr/>
-                <w:p>
-                  <w:pPr>
-                    <w:pStyle w:val="Compact"/>
-                    <w:jc w:val="center"/>
-                  </w:pPr>
-                  <w:r>
-                    <w:t xml:space="preserve">WC-CPP</w:t>
-                  </w:r>
-                </w:p>
-              </w:tc>
-            </w:tr>
-            <w:tr>
-              <w:tc>
-                <w:tcPr>
-                  <w:gridSpan w:val="1"/>
-                  <w:vMerge w:val="continue"/>
-                </w:tcPr>
-                <w:p>
-                  <w:pPr/>
-                </w:p>
-              </w:tc>
-              <w:tc>
-                <w:tcPr/>
-                <w:p>
-                  <w:pPr>
-                    <w:pStyle w:val="Compact"/>
-                    <w:jc w:val="center"/>
-                  </w:pPr>
-                  <w:r>
-                    <w:t xml:space="preserve">A-Mab concentration</w:t>
-                  </w:r>
-                  <w:r>
-                    <w:rPr>
-                      <w:vertAlign w:val="superscript"/>
-                    </w:rPr>
-                    <w:t xml:space="preserve">a)</w:t>
-                  </w:r>
-                </w:p>
-              </w:tc>
-              <w:tc>
-                <w:tcPr/>
-                <w:p>
-                  <w:pPr>
-                    <w:pStyle w:val="Compact"/>
-                    <w:jc w:val="center"/>
-                  </w:pPr>
-                  <w:r>
-                    <w:t xml:space="preserve">g/L</w:t>
-                  </w:r>
-                </w:p>
-              </w:tc>
-              <w:tc>
-                <w:tcPr/>
-                <w:p>
-                  <w:pPr>
-                    <w:pStyle w:val="Compact"/>
-                    <w:jc w:val="center"/>
-                  </w:pPr>
-                  <w:r>
-                    <w:t xml:space="preserve">20</w:t>
-                  </w:r>
-                </w:p>
-              </w:tc>
-              <w:tc>
-                <w:tcPr/>
-                <w:p>
-                  <w:pPr>
-                    <w:pStyle w:val="Compact"/>
-                    <w:jc w:val="center"/>
-                  </w:pPr>
-                  <w:r>
-                    <w:t xml:space="preserve">as characterized</w:t>
-                  </w:r>
-                  <w:r>
-                    <w:rPr>
-                      <w:vertAlign w:val="superscript"/>
-                    </w:rPr>
-                    <w:t xml:space="preserve">b)</w:t>
-                  </w:r>
-                </w:p>
-              </w:tc>
-              <w:tc>
-                <w:tcPr/>
-                <w:p>
-                  <w:pPr>
-                    <w:pStyle w:val="Compact"/>
-                    <w:jc w:val="center"/>
-                  </w:pPr>
-                  <w:r>
-                    <w:t xml:space="preserve">5–35</w:t>
-                  </w:r>
-                </w:p>
-              </w:tc>
-              <w:tc>
-                <w:tcPr/>
-                <w:p>
-                  <w:pPr>
-                    <w:pStyle w:val="Compact"/>
-                    <w:jc w:val="center"/>
-                  </w:pPr>
-                  <w:r>
-                    <w:t xml:space="preserve">GPP</w:t>
-                  </w:r>
-                </w:p>
-              </w:tc>
-            </w:tr>
-            <w:tr>
-              <w:tc>
-                <w:tcPr>
-                  <w:vMerge w:val="restart"/>
-                </w:tcPr>
-                <w:p>
-                  <w:pPr>
-                    <w:pStyle w:val="Compact"/>
-                    <w:jc w:val="center"/>
-                  </w:pPr>
-                  <w:r>
-                    <w:t xml:space="preserve">Cation exchange</w:t>
-                  </w:r>
-                </w:p>
-              </w:tc>
-              <w:tc>
-                <w:tcPr/>
-                <w:p>
-                  <w:pPr>
-                    <w:pStyle w:val="Compact"/>
-                    <w:jc w:val="center"/>
-                  </w:pPr>
-                  <w:r>
-                    <w:t xml:space="preserve">Protein load</w:t>
-                  </w:r>
-                </w:p>
-              </w:tc>
-              <w:tc>
-                <w:tcPr/>
-                <w:p>
-                  <w:pPr>
-                    <w:pStyle w:val="Compact"/>
-                    <w:jc w:val="center"/>
-                  </w:pPr>
-                  <w:r>
-                    <w:t xml:space="preserve">g/L resin</w:t>
-                  </w:r>
-                </w:p>
-              </w:tc>
-              <w:tc>
-                <w:tcPr/>
-                <w:p>
-                  <w:pPr>
-                    <w:pStyle w:val="Compact"/>
-                    <w:jc w:val="center"/>
-                  </w:pPr>
-                  <w:r>
-                    <w:t xml:space="preserve">25</w:t>
-                  </w:r>
-                </w:p>
-              </w:tc>
-              <w:tc>
-                <w:tcPr/>
-                <w:p>
-                  <w:pPr>
-                    <w:pStyle w:val="Compact"/>
-                    <w:jc w:val="center"/>
-                  </w:pPr>
-                  <w:r>
-                    <w:t xml:space="preserve">18–32</w:t>
-                  </w:r>
-                </w:p>
-              </w:tc>
-              <w:tc>
-                <w:tcPr/>
-                <w:p>
-                  <w:pPr>
-                    <w:pStyle w:val="Compact"/>
-                    <w:jc w:val="center"/>
-                  </w:pPr>
-                  <w:r>
-                    <w:t xml:space="preserve">10–40</w:t>
-                  </w:r>
-                </w:p>
-              </w:tc>
-              <w:tc>
-                <w:tcPr/>
-                <w:p>
-                  <w:pPr>
-                    <w:pStyle w:val="Compact"/>
-                    <w:jc w:val="center"/>
-                  </w:pPr>
-                  <w:r>
-                    <w:t xml:space="preserve">WC-CPP</w:t>
-                  </w:r>
-                </w:p>
-              </w:tc>
-            </w:tr>
-            <w:tr>
-              <w:tc>
-                <w:tcPr>
-                  <w:gridSpan w:val="1"/>
-                  <w:vMerge w:val="continue"/>
-                </w:tcPr>
-                <w:p>
-                  <w:pPr/>
-                </w:p>
-              </w:tc>
-              <w:tc>
-                <w:tcPr/>
-                <w:p>
-                  <w:pPr>
-                    <w:pStyle w:val="Compact"/>
-                    <w:jc w:val="center"/>
-                  </w:pPr>
-                  <w:r>
-                    <w:t xml:space="preserve">Load/Wash conductivity</w:t>
-                  </w:r>
-                </w:p>
-              </w:tc>
-              <w:tc>
-                <w:tcPr/>
-                <w:p>
-                  <w:pPr>
-                    <w:pStyle w:val="Compact"/>
-                    <w:jc w:val="center"/>
-                  </w:pPr>
-                  <w:r>
-                    <w:t xml:space="preserve">mS/cm</w:t>
-                  </w:r>
-                </w:p>
-              </w:tc>
-              <w:tc>
-                <w:tcPr/>
-                <w:p>
-                  <w:pPr>
-                    <w:pStyle w:val="Compact"/>
-                    <w:jc w:val="center"/>
-                  </w:pPr>
-                  <w:r>
-                    <w:t xml:space="preserve">5</w:t>
-                  </w:r>
-                </w:p>
-              </w:tc>
-              <w:tc>
-                <w:tcPr/>
-                <w:p>
-                  <w:pPr>
-                    <w:pStyle w:val="Compact"/>
-                    <w:jc w:val="center"/>
-                  </w:pPr>
-                  <w:r>
-                    <w:t xml:space="preserve">4–6</w:t>
-                  </w:r>
-                </w:p>
-              </w:tc>
-              <w:tc>
-                <w:tcPr/>
-                <w:p>
-                  <w:pPr>
-                    <w:pStyle w:val="Compact"/>
-                    <w:jc w:val="center"/>
-                  </w:pPr>
-                  <w:r>
-                    <w:t xml:space="preserve">3–7</w:t>
-                  </w:r>
-                </w:p>
-              </w:tc>
-              <w:tc>
-                <w:tcPr/>
-                <w:p>
-                  <w:pPr>
-                    <w:pStyle w:val="Compact"/>
-                    <w:jc w:val="center"/>
-                  </w:pPr>
-                  <w:r>
-                    <w:t xml:space="preserve">WC-CPP</w:t>
-                  </w:r>
-                </w:p>
-              </w:tc>
-            </w:tr>
-            <w:tr>
-              <w:tc>
-                <w:tcPr>
-                  <w:gridSpan w:val="1"/>
-                  <w:vMerge w:val="continue"/>
-                </w:tcPr>
-                <w:p>
-                  <w:pPr/>
-                </w:p>
-              </w:tc>
-              <w:tc>
-                <w:tcPr/>
-                <w:p>
-                  <w:pPr>
-                    <w:pStyle w:val="Compact"/>
-                    <w:jc w:val="center"/>
-                  </w:pPr>
-                  <w:r>
-                    <w:t xml:space="preserve">Elution buffer pH</w:t>
-                  </w:r>
-                </w:p>
-              </w:tc>
-              <w:tc>
-                <w:tcPr/>
-                <w:p>
-                  <w:pPr>
-                    <w:pStyle w:val="Compact"/>
-                    <w:jc w:val="center"/>
-                  </w:pPr>
-                  <w:r>
-                    <w:t xml:space="preserve">pH</w:t>
-                  </w:r>
-                </w:p>
-              </w:tc>
-              <w:tc>
-                <w:tcPr/>
-                <w:p>
-                  <w:pPr>
-                    <w:pStyle w:val="Compact"/>
-                    <w:jc w:val="center"/>
-                  </w:pPr>
-                  <w:r>
-                    <w:t xml:space="preserve">6</w:t>
-                  </w:r>
-                </w:p>
-              </w:tc>
-              <w:tc>
-                <w:tcPr/>
-                <w:p>
-                  <w:pPr>
-                    <w:pStyle w:val="Compact"/>
-                    <w:jc w:val="center"/>
-                  </w:pPr>
-                  <w:r>
-                    <w:t xml:space="preserve">5.85–6.15</w:t>
-                  </w:r>
-                </w:p>
-              </w:tc>
-              <w:tc>
-                <w:tcPr/>
-                <w:p>
-                  <w:pPr>
-                    <w:pStyle w:val="Compact"/>
-                    <w:jc w:val="center"/>
-                  </w:pPr>
-                  <w:r>
-                    <w:t xml:space="preserve">5.8–6.2</w:t>
-                  </w:r>
-                </w:p>
-              </w:tc>
-              <w:tc>
-                <w:tcPr/>
-                <w:p>
-                  <w:pPr>
-                    <w:pStyle w:val="Compact"/>
-                    <w:jc w:val="center"/>
-                  </w:pPr>
-                  <w:r>
-                    <w:t xml:space="preserve">WC-CPP</w:t>
-                  </w:r>
-                </w:p>
-              </w:tc>
-            </w:tr>
-            <w:tr>
-              <w:tc>
-                <w:tcPr>
-                  <w:gridSpan w:val="1"/>
-                  <w:vMerge w:val="continue"/>
-                </w:tcPr>
-                <w:p>
-                  <w:pPr/>
-                </w:p>
-              </w:tc>
-              <w:tc>
-                <w:tcPr/>
-                <w:p>
-                  <w:pPr>
-                    <w:pStyle w:val="Compact"/>
-                    <w:jc w:val="center"/>
-                  </w:pPr>
-                  <w:r>
-                    <w:t xml:space="preserve">Elution stop collect</w:t>
-                  </w:r>
-                </w:p>
-              </w:tc>
-              <w:tc>
-                <w:tcPr/>
-                <w:p>
-                  <w:pPr>
-                    <w:pStyle w:val="Compact"/>
-                    <w:jc w:val="center"/>
-                  </w:pPr>
-                  <w:r>
-                    <w:t xml:space="preserve">AU (OD280, descending)</w:t>
-                  </w:r>
-                </w:p>
-              </w:tc>
-              <w:tc>
-                <w:tcPr/>
-                <w:p>
-                  <w:pPr>
-                    <w:pStyle w:val="Compact"/>
-                    <w:jc w:val="center"/>
-                  </w:pPr>
-                  <w:r>
-                    <w:t xml:space="preserve">1</w:t>
-                  </w:r>
-                </w:p>
-              </w:tc>
-              <w:tc>
-                <w:tcPr/>
-                <w:p>
-                  <w:pPr>
-                    <w:pStyle w:val="Compact"/>
-                    <w:jc w:val="center"/>
-                  </w:pPr>
-                  <w:r>
-                    <w:t xml:space="preserve">0.7–1.3</w:t>
-                  </w:r>
-                </w:p>
-              </w:tc>
-              <w:tc>
-                <w:tcPr/>
-                <w:p>
-                  <w:pPr>
-                    <w:pStyle w:val="Compact"/>
-                    <w:jc w:val="center"/>
-                  </w:pPr>
-                  <w:r>
-                    <w:t xml:space="preserve">0.5–1.5</w:t>
-                  </w:r>
-                </w:p>
-              </w:tc>
-              <w:tc>
-                <w:tcPr/>
-                <w:p>
-                  <w:pPr>
-                    <w:pStyle w:val="Compact"/>
-                    <w:jc w:val="center"/>
-                  </w:pPr>
-                  <w:r>
-                    <w:t xml:space="preserve">WC-CPP</w:t>
-                  </w:r>
-                </w:p>
-              </w:tc>
-            </w:tr>
-            <w:tr>
-              <w:tc>
-                <w:tcPr>
-                  <w:gridSpan w:val="1"/>
-                  <w:vMerge w:val="continue"/>
-                </w:tcPr>
-                <w:p>
-                  <w:pPr/>
-                </w:p>
-              </w:tc>
-              <w:tc>
-                <w:tcPr/>
-                <w:p>
-                  <w:pPr>
-                    <w:pStyle w:val="Compact"/>
-                    <w:jc w:val="center"/>
-                  </w:pPr>
-                  <w:r>
-                    <w:t xml:space="preserve">Elution flow rate</w:t>
-                  </w:r>
-                  <w:r>
-                    <w:rPr>
-                      <w:vertAlign w:val="superscript"/>
-                    </w:rPr>
-                    <w:t xml:space="preserve">a)</w:t>
-                  </w:r>
-                </w:p>
-              </w:tc>
-              <w:tc>
-                <w:tcPr/>
-                <w:p>
-                  <w:pPr>
-                    <w:pStyle w:val="Compact"/>
-                    <w:jc w:val="center"/>
-                  </w:pPr>
-                  <w:r>
-                    <w:t xml:space="preserve">cm/hr</w:t>
-                  </w:r>
-                </w:p>
-              </w:tc>
-              <w:tc>
-                <w:tcPr/>
-                <w:p>
-                  <w:pPr>
-                    <w:pStyle w:val="Compact"/>
-                    <w:jc w:val="center"/>
-                  </w:pPr>
-                  <w:r>
-                    <w:t xml:space="preserve">200</w:t>
-                  </w:r>
-                </w:p>
-              </w:tc>
-              <w:tc>
-                <w:tcPr/>
-                <w:p>
-                  <w:pPr>
-                    <w:pStyle w:val="Compact"/>
-                    <w:jc w:val="center"/>
-                  </w:pPr>
-                  <w:r>
-                    <w:t xml:space="preserve">150–250</w:t>
-                  </w:r>
-                </w:p>
-              </w:tc>
-              <w:tc>
-                <w:tcPr/>
-                <w:p>
-                  <w:pPr>
-                    <w:pStyle w:val="Compact"/>
-                    <w:jc w:val="center"/>
-                  </w:pPr>
-                  <w:r>
-                    <w:t xml:space="preserve">100–300</w:t>
-                  </w:r>
-                </w:p>
-              </w:tc>
-              <w:tc>
-                <w:tcPr/>
-                <w:p>
-                  <w:pPr>
-                    <w:pStyle w:val="Compact"/>
-                    <w:jc w:val="center"/>
-                  </w:pPr>
-                  <w:r>
-                    <w:t xml:space="preserve">GPP</w:t>
-                  </w:r>
-                </w:p>
-              </w:tc>
-            </w:tr>
-            <w:tr>
-              <w:tc>
-                <w:tcPr>
-                  <w:vMerge w:val="restart"/>
-                </w:tcPr>
-                <w:p>
-                  <w:pPr>
-                    <w:pStyle w:val="Compact"/>
-                    <w:jc w:val="center"/>
-                  </w:pPr>
-                  <w:r>
-                    <w:t xml:space="preserve">Anion exchange</w:t>
-                  </w:r>
-                </w:p>
-              </w:tc>
-              <w:tc>
-                <w:tcPr/>
-                <w:p>
-                  <w:pPr>
-                    <w:pStyle w:val="Compact"/>
-                    <w:jc w:val="center"/>
-                  </w:pPr>
-                  <w:r>
-                    <w:t xml:space="preserve">Load pH</w:t>
-                  </w:r>
-                </w:p>
-              </w:tc>
-              <w:tc>
-                <w:tcPr/>
-                <w:p>
-                  <w:pPr>
-                    <w:pStyle w:val="Compact"/>
-                    <w:jc w:val="center"/>
-                  </w:pPr>
-                  <w:r>
-                    <w:t xml:space="preserve">pH</w:t>
-                  </w:r>
-                </w:p>
-              </w:tc>
-              <w:tc>
-                <w:tcPr/>
-                <w:p>
-                  <w:pPr>
-                    <w:pStyle w:val="Compact"/>
-                    <w:jc w:val="center"/>
-                  </w:pPr>
-                  <w:r>
-                    <w:t xml:space="preserve">7.5</w:t>
-                  </w:r>
-                </w:p>
-              </w:tc>
-              <w:tc>
-                <w:tcPr/>
-                <w:p>
-                  <w:pPr>
-                    <w:pStyle w:val="Compact"/>
-                    <w:jc w:val="center"/>
-                  </w:pPr>
-                  <w:r>
-                    <w:t xml:space="preserve">7.35–7.65</w:t>
-                  </w:r>
-                </w:p>
-              </w:tc>
-              <w:tc>
-                <w:tcPr/>
-                <w:p>
-                  <w:pPr>
-                    <w:pStyle w:val="Compact"/>
-                    <w:jc w:val="center"/>
-                  </w:pPr>
-                  <w:r>
-                    <w:t xml:space="preserve">7.2–7.8</w:t>
-                  </w:r>
-                </w:p>
-              </w:tc>
-              <w:tc>
-                <w:tcPr/>
-                <w:p>
-                  <w:pPr>
-                    <w:pStyle w:val="Compact"/>
-                    <w:jc w:val="center"/>
-                  </w:pPr>
-                  <w:r>
-                    <w:t xml:space="preserve">WC-CPP</w:t>
-                  </w:r>
-                </w:p>
-              </w:tc>
-            </w:tr>
-            <w:tr>
-              <w:tc>
-                <w:tcPr>
-                  <w:gridSpan w:val="1"/>
-                  <w:vMerge w:val="continue"/>
-                </w:tcPr>
-                <w:p>
-                  <w:pPr/>
-                </w:p>
-              </w:tc>
-              <w:tc>
-                <w:tcPr/>
-                <w:p>
-                  <w:pPr>
-                    <w:pStyle w:val="Compact"/>
-                    <w:jc w:val="center"/>
-                  </w:pPr>
-                  <w:r>
-                    <w:t xml:space="preserve">Equil/Wash-1 conductivity</w:t>
-                  </w:r>
-                </w:p>
-              </w:tc>
-              <w:tc>
-                <w:tcPr/>
-                <w:p>
-                  <w:pPr>
-                    <w:pStyle w:val="Compact"/>
-                    <w:jc w:val="center"/>
-                  </w:pPr>
-                  <w:r>
-                    <w:t xml:space="preserve">mS/cm</w:t>
-                  </w:r>
-                </w:p>
-              </w:tc>
-              <w:tc>
-                <w:tcPr/>
-                <w:p>
-                  <w:pPr>
-                    <w:pStyle w:val="Compact"/>
-                    <w:jc w:val="center"/>
-                  </w:pPr>
-                  <w:r>
-                    <w:t xml:space="preserve">2.6</w:t>
-                  </w:r>
-                </w:p>
-              </w:tc>
-              <w:tc>
-                <w:tcPr/>
-                <w:p>
-                  <w:pPr>
-                    <w:pStyle w:val="Compact"/>
-                    <w:jc w:val="center"/>
-                  </w:pPr>
-                  <w:r>
-                    <w:t xml:space="preserve">2.1–3.1</w:t>
-                  </w:r>
-                </w:p>
-              </w:tc>
-              <w:tc>
-                <w:tcPr/>
-                <w:p>
-                  <w:pPr>
-                    <w:pStyle w:val="Compact"/>
-                    <w:jc w:val="center"/>
-                  </w:pPr>
-                  <w:r>
-                    <w:t xml:space="preserve">1.6–3.6</w:t>
-                  </w:r>
-                </w:p>
-              </w:tc>
-              <w:tc>
-                <w:tcPr/>
-                <w:p>
-                  <w:pPr>
-                    <w:pStyle w:val="Compact"/>
-                    <w:jc w:val="center"/>
-                  </w:pPr>
-                  <w:r>
-                    <w:t xml:space="preserve">WC-CPP</w:t>
-                  </w:r>
-                </w:p>
-              </w:tc>
-            </w:tr>
-            <w:tr>
-              <w:tc>
-                <w:tcPr>
-                  <w:gridSpan w:val="1"/>
-                  <w:vMerge w:val="continue"/>
-                </w:tcPr>
-                <w:p>
-                  <w:pPr/>
-                </w:p>
-              </w:tc>
-              <w:tc>
-                <w:tcPr/>
-                <w:p>
-                  <w:pPr>
-                    <w:pStyle w:val="Compact"/>
-                    <w:jc w:val="center"/>
-                  </w:pPr>
-                  <w:r>
-                    <w:t xml:space="preserve">Load conductivity</w:t>
-                  </w:r>
-                </w:p>
-              </w:tc>
-              <w:tc>
-                <w:tcPr/>
-                <w:p>
-                  <w:pPr>
-                    <w:pStyle w:val="Compact"/>
-                    <w:jc w:val="center"/>
-                  </w:pPr>
-                  <w:r>
-                    <w:t xml:space="preserve">mS/cm</w:t>
-                  </w:r>
-                </w:p>
-              </w:tc>
-              <w:tc>
-                <w:tcPr/>
-                <w:p>
-                  <w:pPr>
-                    <w:pStyle w:val="Compact"/>
-                    <w:jc w:val="center"/>
-                  </w:pPr>
-                  <w:r>
-                    <w:t xml:space="preserve">5.5</w:t>
-                  </w:r>
-                </w:p>
-              </w:tc>
-              <w:tc>
-                <w:tcPr/>
-                <w:p>
-                  <w:pPr>
-                    <w:pStyle w:val="Compact"/>
-                    <w:jc w:val="center"/>
-                  </w:pPr>
-                  <w:r>
-                    <w:t xml:space="preserve">4–7</w:t>
-                  </w:r>
-                </w:p>
-              </w:tc>
-              <w:tc>
-                <w:tcPr/>
-                <w:p>
-                  <w:pPr>
-                    <w:pStyle w:val="Compact"/>
-                    <w:jc w:val="center"/>
-                  </w:pPr>
-                  <w:r>
-                    <w:t xml:space="preserve">3–8</w:t>
-                  </w:r>
-                </w:p>
-              </w:tc>
-              <w:tc>
-                <w:tcPr/>
-                <w:p>
-                  <w:pPr>
-                    <w:pStyle w:val="Compact"/>
-                    <w:jc w:val="center"/>
-                  </w:pPr>
-                  <w:r>
-                    <w:t xml:space="preserve">WC-CPP</w:t>
-                  </w:r>
-                </w:p>
-              </w:tc>
-            </w:tr>
-            <w:tr>
-              <w:tc>
-                <w:tcPr>
-                  <w:gridSpan w:val="1"/>
-                  <w:vMerge w:val="continue"/>
-                </w:tcPr>
-                <w:p>
-                  <w:pPr/>
-                </w:p>
-              </w:tc>
-              <w:tc>
-                <w:tcPr/>
-                <w:p>
-                  <w:pPr>
-                    <w:pStyle w:val="Compact"/>
-                    <w:jc w:val="center"/>
-                  </w:pPr>
-                  <w:r>
-                    <w:t xml:space="preserve">Protein load</w:t>
-                  </w:r>
-                </w:p>
-              </w:tc>
-              <w:tc>
-                <w:tcPr/>
-                <w:p>
-                  <w:pPr>
-                    <w:pStyle w:val="Compact"/>
-                    <w:jc w:val="center"/>
-                  </w:pPr>
-                  <w:r>
-                    <w:t xml:space="preserve">g/L resin</w:t>
-                  </w:r>
-                </w:p>
-              </w:tc>
-              <w:tc>
-                <w:tcPr/>
-                <w:p>
-                  <w:pPr>
-                    <w:pStyle w:val="Compact"/>
-                    <w:jc w:val="center"/>
-                  </w:pPr>
-                  <w:r>
-                    <w:t xml:space="preserve">200</w:t>
-                  </w:r>
-                </w:p>
-              </w:tc>
-              <w:tc>
-                <w:tcPr/>
-                <w:p>
-                  <w:pPr>
-                    <w:pStyle w:val="Compact"/>
-                    <w:jc w:val="center"/>
-                  </w:pPr>
-                  <w:r>
-                    <w:t xml:space="preserve">120–280</w:t>
-                  </w:r>
-                </w:p>
-              </w:tc>
-              <w:tc>
-                <w:tcPr/>
-                <w:p>
-                  <w:pPr>
-                    <w:pStyle w:val="Compact"/>
-                    <w:jc w:val="center"/>
-                  </w:pPr>
-                  <w:r>
-                    <w:t xml:space="preserve">50–300</w:t>
-                  </w:r>
-                </w:p>
-              </w:tc>
-              <w:tc>
-                <w:tcPr/>
-                <w:p>
-                  <w:pPr>
-                    <w:pStyle w:val="Compact"/>
-                    <w:jc w:val="center"/>
-                  </w:pPr>
-                  <w:r>
-                    <w:t xml:space="preserve">WC-CPP</w:t>
-                  </w:r>
-                </w:p>
-              </w:tc>
-            </w:tr>
-            <w:tr>
-              <w:tc>
-                <w:tcPr>
-                  <w:gridSpan w:val="1"/>
-                  <w:vMerge w:val="continue"/>
-                </w:tcPr>
-                <w:p>
-                  <w:pPr/>
-                </w:p>
-              </w:tc>
-              <w:tc>
-                <w:tcPr/>
-                <w:p>
-                  <w:pPr>
-                    <w:pStyle w:val="Compact"/>
-                    <w:jc w:val="center"/>
-                  </w:pPr>
-                  <w:r>
-                    <w:t xml:space="preserve">Operating flow rate</w:t>
-                  </w:r>
-                  <w:r>
-                    <w:rPr>
-                      <w:vertAlign w:val="superscript"/>
-                    </w:rPr>
-                    <w:t xml:space="preserve">a)</w:t>
-                  </w:r>
-                </w:p>
-              </w:tc>
-              <w:tc>
-                <w:tcPr/>
-                <w:p>
-                  <w:pPr>
-                    <w:pStyle w:val="Compact"/>
-                    <w:jc w:val="center"/>
-                  </w:pPr>
-                  <w:r>
-                    <w:t xml:space="preserve">cm/hr</w:t>
-                  </w:r>
-                </w:p>
-              </w:tc>
-              <w:tc>
-                <w:tcPr/>
-                <w:p>
-                  <w:pPr>
-                    <w:pStyle w:val="Compact"/>
-                    <w:jc w:val="center"/>
-                  </w:pPr>
-                  <w:r>
-                    <w:t xml:space="preserve">300</w:t>
-                  </w:r>
-                </w:p>
-              </w:tc>
-              <w:tc>
-                <w:tcPr/>
-                <w:p>
-                  <w:pPr>
-                    <w:pStyle w:val="Compact"/>
-                    <w:jc w:val="center"/>
-                  </w:pPr>
-                  <w:r>
-                    <w:t xml:space="preserve">200–400</w:t>
-                  </w:r>
-                </w:p>
-              </w:tc>
-              <w:tc>
-                <w:tcPr/>
-                <w:p>
-                  <w:pPr>
-                    <w:pStyle w:val="Compact"/>
-                    <w:jc w:val="center"/>
-                  </w:pPr>
-                  <w:r>
-                    <w:t xml:space="preserve">150–450</w:t>
-                  </w:r>
-                </w:p>
-              </w:tc>
-              <w:tc>
-                <w:tcPr/>
-                <w:p>
-                  <w:pPr>
-                    <w:pStyle w:val="Compact"/>
-                    <w:jc w:val="center"/>
-                  </w:pPr>
-                  <w:r>
-                    <w:t xml:space="preserve">WC-CPP</w:t>
-                  </w:r>
-                </w:p>
-              </w:tc>
-            </w:tr>
-            <w:tr>
-              <w:tc>
-                <w:tcPr>
-                  <w:vMerge w:val="restart"/>
-                </w:tcPr>
-                <w:p>
-                  <w:pPr>
-                    <w:pStyle w:val="Compact"/>
-                    <w:jc w:val="center"/>
-                  </w:pPr>
-                  <w:r>
-                    <w:t xml:space="preserve">Virus filtration</w:t>
-                  </w:r>
-                </w:p>
-              </w:tc>
-              <w:tc>
-                <w:tcPr/>
-                <w:p>
-                  <w:pPr>
-                    <w:pStyle w:val="Compact"/>
-                    <w:jc w:val="center"/>
-                  </w:pPr>
-                  <w:r>
-                    <w:t xml:space="preserve">Filtration volume (load)</w:t>
-                  </w:r>
-                </w:p>
-              </w:tc>
-              <w:tc>
-                <w:tcPr/>
-                <w:p>
-                  <w:pPr>
-                    <w:pStyle w:val="Compact"/>
-                    <w:jc w:val="center"/>
-                  </w:pPr>
-                  <w:r>
-                    <w:t xml:space="preserve">L/m2</w:t>
-                  </w:r>
-                </w:p>
-              </w:tc>
-              <w:tc>
-                <w:tcPr/>
-                <w:p>
-                  <w:pPr>
-                    <w:pStyle w:val="Compact"/>
-                    <w:jc w:val="center"/>
-                  </w:pPr>
-                  <w:r>
-                    <w:t xml:space="preserve">90</w:t>
-                  </w:r>
-                </w:p>
-              </w:tc>
-              <w:tc>
-                <w:tcPr/>
-                <w:p>
-                  <w:pPr>
-                    <w:pStyle w:val="Compact"/>
-                    <w:jc w:val="center"/>
-                  </w:pPr>
-                  <w:r>
-                    <w:t xml:space="preserve">50–105</w:t>
-                  </w:r>
-                </w:p>
-              </w:tc>
-              <w:tc>
-                <w:tcPr/>
-                <w:p>
-                  <w:pPr>
-                    <w:pStyle w:val="Compact"/>
-                    <w:jc w:val="center"/>
-                  </w:pPr>
-                  <w:r>
-                    <w:t xml:space="preserve">50–140</w:t>
-                  </w:r>
-                </w:p>
-              </w:tc>
-              <w:tc>
-                <w:tcPr/>
-                <w:p>
-                  <w:pPr>
-                    <w:pStyle w:val="Compact"/>
-                    <w:jc w:val="center"/>
-                  </w:pPr>
-                  <w:r>
-                    <w:t xml:space="preserve">WC-CPP</w:t>
-                  </w:r>
-                </w:p>
-              </w:tc>
-            </w:tr>
-            <w:tr>
-              <w:tc>
-                <w:tcPr>
-                  <w:gridSpan w:val="1"/>
-                  <w:vMerge w:val="continue"/>
-                </w:tcPr>
-                <w:p>
-                  <w:pPr/>
-                </w:p>
-              </w:tc>
-              <w:tc>
-                <w:tcPr/>
-                <w:p>
-                  <w:pPr>
-                    <w:pStyle w:val="Compact"/>
-                    <w:jc w:val="center"/>
-                  </w:pPr>
-                  <w:r>
-                    <w:t xml:space="preserve">Filtration pressure</w:t>
-                  </w:r>
-                </w:p>
-              </w:tc>
-              <w:tc>
-                <w:tcPr/>
-                <w:p>
-                  <w:pPr>
-                    <w:pStyle w:val="Compact"/>
-                    <w:jc w:val="center"/>
-                  </w:pPr>
-                  <w:r>
-                    <w:t xml:space="preserve">psi</w:t>
-                  </w:r>
-                </w:p>
-              </w:tc>
-              <w:tc>
-                <w:tcPr/>
-                <w:p>
-                  <w:pPr>
-                    <w:pStyle w:val="Compact"/>
-                    <w:jc w:val="center"/>
-                  </w:pPr>
-                  <w:r>
-                    <w:t xml:space="preserve">13</w:t>
-                  </w:r>
-                </w:p>
-              </w:tc>
-              <w:tc>
-                <w:tcPr/>
-                <w:p>
-                  <w:pPr>
-                    <w:pStyle w:val="Compact"/>
-                    <w:jc w:val="center"/>
-                  </w:pPr>
-                  <w:r>
-                    <w:t xml:space="preserve">10–20</w:t>
-                  </w:r>
-                </w:p>
-              </w:tc>
-              <w:tc>
-                <w:tcPr/>
-                <w:p>
-                  <w:pPr>
-                    <w:pStyle w:val="Compact"/>
-                    <w:jc w:val="center"/>
-                  </w:pPr>
-                  <w:r>
-                    <w:t xml:space="preserve">8–30</w:t>
-                  </w:r>
-                </w:p>
-              </w:tc>
-              <w:tc>
-                <w:tcPr/>
-                <w:p>
-                  <w:pPr>
-                    <w:pStyle w:val="Compact"/>
-                    <w:jc w:val="center"/>
-                  </w:pPr>
-                  <w:r>
-                    <w:t xml:space="preserve">WC-CPP</w:t>
-                  </w:r>
-                </w:p>
-              </w:tc>
-            </w:tr>
-            <w:tr>
-              <w:tc>
-                <w:tcPr>
-                  <w:vMerge w:val="restart"/>
-                </w:tcPr>
-                <w:p>
-                  <w:pPr>
-                    <w:pStyle w:val="Compact"/>
-                    <w:jc w:val="center"/>
-                  </w:pPr>
-                  <w:r>
-                    <w:t xml:space="preserve">UF/DF</w:t>
-                  </w:r>
-                </w:p>
-              </w:tc>
-              <w:tc>
-                <w:tcPr/>
-                <w:p>
-                  <w:pPr>
-                    <w:pStyle w:val="Compact"/>
-                    <w:jc w:val="center"/>
-                  </w:pPr>
-                  <w:r>
-                    <w:t xml:space="preserve">Number of diavolumes</w:t>
-                  </w:r>
-                  <w:r>
-                    <w:rPr>
-                      <w:vertAlign w:val="superscript"/>
-                    </w:rPr>
-                    <w:t xml:space="preserve">a)</w:t>
-                  </w:r>
-                </w:p>
-              </w:tc>
-              <w:tc>
-                <w:tcPr/>
-                <w:p>
-                  <w:pPr>
-                    <w:pStyle w:val="Compact"/>
-                    <w:jc w:val="center"/>
-                  </w:pPr>
-                  <w:r>
-                    <w:t xml:space="preserve">DV</w:t>
-                  </w:r>
-                </w:p>
-              </w:tc>
-              <w:tc>
-                <w:tcPr/>
-                <w:p>
-                  <w:pPr>
-                    <w:pStyle w:val="Compact"/>
-                    <w:jc w:val="center"/>
-                  </w:pPr>
-                  <w:r>
-                    <w:t xml:space="preserve">8</w:t>
-                  </w:r>
-                </w:p>
-              </w:tc>
-              <w:tc>
-                <w:tcPr/>
-                <w:p>
-                  <w:pPr>
-                    <w:pStyle w:val="Compact"/>
-                    <w:jc w:val="center"/>
-                  </w:pPr>
-                  <w:r>
-                    <w:t xml:space="preserve">7–9</w:t>
-                  </w:r>
-                </w:p>
-              </w:tc>
-              <w:tc>
-                <w:tcPr/>
-                <w:p>
-                  <w:pPr>
-                    <w:pStyle w:val="Compact"/>
-                    <w:jc w:val="center"/>
-                  </w:pPr>
-                  <w:r>
-                    <w:t xml:space="preserve">7–10</w:t>
-                  </w:r>
-                </w:p>
-              </w:tc>
-              <w:tc>
-                <w:tcPr/>
-                <w:p>
-                  <w:pPr>
-                    <w:pStyle w:val="Compact"/>
-                    <w:jc w:val="center"/>
-                  </w:pPr>
-                  <w:r>
-                    <w:t xml:space="preserve">KPP</w:t>
-                  </w:r>
-                </w:p>
-              </w:tc>
-            </w:tr>
-            <w:tr>
-              <w:tc>
-                <w:tcPr>
-                  <w:gridSpan w:val="1"/>
-                  <w:vMerge w:val="continue"/>
-                </w:tcPr>
-                <w:p>
-                  <w:pPr/>
-                </w:p>
-              </w:tc>
-              <w:tc>
-                <w:tcPr/>
-                <w:p>
-                  <w:pPr>
-                    <w:pStyle w:val="Compact"/>
-                    <w:jc w:val="center"/>
-                  </w:pPr>
-                  <w:r>
-                    <w:t xml:space="preserve">Transmembrane pressure</w:t>
-                  </w:r>
-                  <w:r>
-                    <w:rPr>
-                      <w:vertAlign w:val="superscript"/>
-                    </w:rPr>
-                    <w:t xml:space="preserve">a)</w:t>
-                  </w:r>
-                </w:p>
-              </w:tc>
-              <w:tc>
-                <w:tcPr/>
-                <w:p>
-                  <w:pPr>
-                    <w:pStyle w:val="Compact"/>
-                    <w:jc w:val="center"/>
-                  </w:pPr>
-                  <w:r>
-                    <w:t xml:space="preserve">psi</w:t>
-                  </w:r>
-                </w:p>
-              </w:tc>
-              <w:tc>
-                <w:tcPr/>
-                <w:p>
-                  <w:pPr>
-                    <w:pStyle w:val="Compact"/>
-                    <w:jc w:val="center"/>
-                  </w:pPr>
-                  <w:r>
-                    <w:t xml:space="preserve">12</w:t>
-                  </w:r>
-                </w:p>
-              </w:tc>
-              <w:tc>
-                <w:tcPr/>
-                <w:p>
-                  <w:pPr>
-                    <w:pStyle w:val="Compact"/>
-                    <w:jc w:val="center"/>
-                  </w:pPr>
-                  <w:r>
-                    <w:t xml:space="preserve">10–14</w:t>
-                  </w:r>
-                </w:p>
-              </w:tc>
-              <w:tc>
-                <w:tcPr/>
-                <w:p>
-                  <w:pPr>
-                    <w:pStyle w:val="Compact"/>
-                    <w:jc w:val="center"/>
-                  </w:pPr>
-                  <w:r>
-                    <w:t xml:space="preserve">10–15</w:t>
-                  </w:r>
-                </w:p>
-              </w:tc>
-              <w:tc>
-                <w:tcPr/>
-                <w:p>
-                  <w:pPr>
-                    <w:pStyle w:val="Compact"/>
-                    <w:jc w:val="center"/>
-                  </w:pPr>
-                  <w:r>
-                    <w:t xml:space="preserve">KPP</w:t>
-                  </w:r>
-                </w:p>
-              </w:tc>
-            </w:tr>
-            <w:tr>
-              <w:tc>
-                <w:tcPr>
-                  <w:gridSpan w:val="1"/>
-                  <w:vMerge w:val="continue"/>
-                </w:tcPr>
-                <w:p>
-                  <w:pPr/>
-                </w:p>
-              </w:tc>
-              <w:tc>
-                <w:tcPr/>
-                <w:p>
-                  <w:pPr>
-                    <w:pStyle w:val="Compact"/>
-                    <w:jc w:val="center"/>
-                  </w:pPr>
-                  <w:r>
-                    <w:t xml:space="preserve">Final DS concentration</w:t>
-                  </w:r>
-                  <w:r>
-                    <w:rPr>
-                      <w:vertAlign w:val="superscript"/>
-                    </w:rPr>
-                    <w:t xml:space="preserve">a)</w:t>
-                  </w:r>
-                </w:p>
-              </w:tc>
-              <w:tc>
-                <w:tcPr/>
-                <w:p>
-                  <w:pPr>
-                    <w:pStyle w:val="Compact"/>
-                    <w:jc w:val="center"/>
-                  </w:pPr>
-                  <w:r>
-                    <w:t xml:space="preserve">g/L</w:t>
-                  </w:r>
-                </w:p>
-              </w:tc>
-              <w:tc>
-                <w:tcPr/>
-                <w:p>
-                  <w:pPr>
-                    <w:pStyle w:val="Compact"/>
-                    <w:jc w:val="center"/>
-                  </w:pPr>
-                  <w:r>
-                    <w:t xml:space="preserve">75</w:t>
-                  </w:r>
-                </w:p>
-              </w:tc>
-              <w:tc>
-                <w:tcPr/>
-                <w:p>
-                  <w:pPr>
-                    <w:pStyle w:val="Compact"/>
-                    <w:jc w:val="center"/>
-                  </w:pPr>
-                  <w:r>
-                    <w:t xml:space="preserve">70–80</w:t>
-                  </w:r>
-                </w:p>
-              </w:tc>
-              <w:tc>
-                <w:tcPr/>
-                <w:p>
-                  <w:pPr>
-                    <w:pStyle w:val="Compact"/>
-                    <w:jc w:val="center"/>
-                  </w:pPr>
-                  <w:r>
-                    <w:t xml:space="preserve">65–85</w:t>
-                  </w:r>
-                </w:p>
-              </w:tc>
-              <w:tc>
-                <w:tcPr/>
-                <w:p>
-                  <w:pPr>
-                    <w:pStyle w:val="Compact"/>
-                    <w:jc w:val="center"/>
-                  </w:pPr>
-                  <w:r>
-                    <w:t xml:space="preserve">KPP</w:t>
-                  </w:r>
-                </w:p>
-              </w:tc>
-            </w:tr>
-            <w:tr>
-              <w:tc>
-                <w:tcPr>
-                  <w:gridSpan w:val="7"/>
-                </w:tcPr>
-                <w:p>
-                  <w:pPr>
-                    <w:pStyle w:val="Compact"/>
-                    <w:jc w:val="center"/>
-                  </w:pPr>
-                  <w:r>
-                    <w:rPr>
-                      <w:vertAlign w:val="superscript"/>
-                    </w:rPr>
-                    <w:t xml:space="preserve">a)</w:t>
-                  </w:r>
-                  <w:r>
-                    <w:t xml:space="preserve"> </w:t>
-                  </w:r>
-                  <w:r>
-                    <w:t xml:space="preserve">Studied one factor at a time. Every other parameter was studied in the designed experiments of its step.</w:t>
-                  </w:r>
-                </w:p>
-              </w:tc>
-            </w:tr>
-            <w:tr>
-              <w:tc>
-                <w:tcPr>
-                  <w:gridSpan w:val="7"/>
-                </w:tcPr>
-                <w:p>
-                  <w:pPr>
-                    <w:pStyle w:val="Compact"/>
-                    <w:jc w:val="center"/>
-                  </w:pPr>
-                  <w:r>
-                    <w:rPr>
-                      <w:vertAlign w:val="superscript"/>
-                    </w:rPr>
-                    <w:t xml:space="preserve">b)</w:t>
-                  </w:r>
-                  <w:r>
-                    <w:t xml:space="preserve"> </w:t>
-                  </w:r>
-                  <w:r>
-                    <w:t xml:space="preserve">The normal operating range equals the characterized range.</w:t>
-                  </w:r>
-                </w:p>
-              </w:tc>
-            </w:tr>
-            <w:tr>
-              <w:tc>
-                <w:tcPr>
-                  <w:gridSpan w:val="7"/>
-                </w:tcPr>
-                <w:p>
-                  <w:pPr>
-                    <w:pStyle w:val="Compact"/>
-                    <w:jc w:val="center"/>
-                  </w:pPr>
-                  <w:r>
-                    <w:rPr>
-                      <w:vertAlign w:val="superscript"/>
-                    </w:rPr>
-                    <w:t xml:space="preserve">c1)</w:t>
-                  </w:r>
-                  <w:r>
-                    <w:t xml:space="preserve"> </w:t>
-                  </w:r>
-                  <w:r>
-                    <w:t xml:space="preserve">Narrowed at Version 2.0 from 20–40 g/L resin, the NOR as characterized (PCR-005).</w:t>
-                  </w:r>
-                </w:p>
-              </w:tc>
-            </w:tr>
-            <w:tr>
-              <w:tc>
-                <w:tcPr>
-                  <w:gridSpan w:val="7"/>
-                </w:tcPr>
-                <w:p>
-                  <w:pPr>
-                    <w:pStyle w:val="Compact"/>
-                    <w:jc w:val="center"/>
-                  </w:pPr>
-                  <w:r>
-                    <w:rPr>
-                      <w:vertAlign w:val="superscript"/>
-                    </w:rPr>
-                    <w:t xml:space="preserve">c2)</w:t>
-                  </w:r>
-                  <w:r>
-                    <w:t xml:space="preserve"> </w:t>
-                  </w:r>
-                  <w:r>
-                    <w:t xml:space="preserve">Moved at Version 2.0 from pH 3.4–3.6, the NOR as characterized (PCR-006).</w:t>
-                  </w:r>
-                </w:p>
-              </w:tc>
-            </w:tr>
-            <w:tr>
-              <w:tc>
-                <w:tcPr>
-                  <w:gridSpan w:val="7"/>
-                </w:tcPr>
-                <w:p>
-                  <w:pPr>
-                    <w:pStyle w:val="Compact"/>
-                    <w:jc w:val="center"/>
-                  </w:pPr>
-                  <w:r>
-                    <w:rPr>
-                      <w:vertAlign w:val="superscript"/>
-                    </w:rPr>
-                    <w:t xml:space="preserve">c3)</w:t>
-                  </w:r>
-                  <w:r>
-                    <w:t xml:space="preserve"> </w:t>
-                  </w:r>
-                  <w:r>
-                    <w:t xml:space="preserve">Moved at Version 2.0 from pH 3.5, the set-point in the characterization plan (PCR-006).</w:t>
-                  </w:r>
-                </w:p>
-              </w:tc>
-            </w:tr>
-            <w:tr>
-              <w:tc>
-                <w:tcPr>
-                  <w:gridSpan w:val="7"/>
-                </w:tcPr>
-                <w:p>
-                  <w:pPr>
-                    <w:pStyle w:val="Compact"/>
-                    <w:jc w:val="center"/>
-                  </w:pPr>
-                  <w:r>
-                    <w:rPr>
-                      <w:vertAlign w:val="superscript"/>
-                    </w:rPr>
-                    <w:t xml:space="preserve">c4)</w:t>
-                  </w:r>
-                  <w:r>
-                    <w:t xml:space="preserve"> </w:t>
-                  </w:r>
-                  <w:r>
-                    <w:t xml:space="preserve">Narrowed at Version 2.0 from 60–120 min, the NOR as characterized (PCR-006).</w:t>
-                  </w:r>
-                </w:p>
-              </w:tc>
-            </w:tr>
-            <w:tr>
-              <w:tc>
-                <w:tcPr>
-                  <w:gridSpan w:val="7"/>
-                </w:tcPr>
-                <w:p>
-                  <w:pPr>
-                    <w:pStyle w:val="Compact"/>
-                    <w:jc w:val="center"/>
-                  </w:pPr>
-                  <w:r>
-                    <w:rPr>
-                      <w:vertAlign w:val="superscript"/>
-                    </w:rPr>
-                    <w:t xml:space="preserve">c5)</w:t>
-                  </w:r>
-                  <w:r>
-                    <w:t xml:space="preserve"> </w:t>
-                  </w:r>
-                  <w:r>
-                    <w:t xml:space="preserve">Moved at Version 2.0 from 90 min, the set-point in the characterization plan (PCR-006).</w:t>
-                  </w:r>
-                </w:p>
-              </w:tc>
-            </w:tr>
-            <w:tr>
-              <w:tc>
-                <w:tcPr>
-                  <w:gridSpan w:val="7"/>
-                </w:tcPr>
-                <w:p>
-                  <w:pPr>
-                    <w:pStyle w:val="Compact"/>
-                    <w:jc w:val="center"/>
-                  </w:pPr>
-                  <w:r>
-                    <w:rPr>
-                      <w:vertAlign w:val="superscript"/>
-                    </w:rPr>
-                    <w:t xml:space="preserve">c6)</w:t>
                   </w:r>
                   <w:r>
                     <w:t xml:space="preserve"> </w:t>

</xml_diff>